<commit_message>
Yontem karsilastirmasinin yedi ciktisi models/ altinda Git LFS ile surumlendi
</commit_message>
<xml_diff>
--- a/docs/raporlar/hafta-03_raporu.docx
+++ b/docs/raporlar/hafta-03_raporu.docx
@@ -5117,11 +5117,36 @@
           <w:rFonts w:ascii="Consolas" w:hAnsi="Consolas"/>
           <w:sz w:val="17"/>
         </w:rPr>
-        <w:t>data/&lt;veri-kümesi&gt;/             ham kareler ve COLMAP çıktıları</w:t>
+        <w:t>data/&lt;veri-kümesi&gt;/        ham kareler ve COLMAP çıktıları</w:t>
         <w:br/>
-        <w:t>runs/&lt;veri-kümesi&gt;/&lt;koşu&gt;/      eğitim çıktıları ve kontrol noktaları</w:t>
-        <w:br/>
-        <w:t>exports/&lt;veri-kümesi&gt;/&lt;koşu&gt;/   dışa aktarılan splat.ply</w:t>
+        <w:t>runs/&lt;veri-kümesi&gt;/&lt;koşu&gt;/ eğitim çıktıları ve kontrol noktaları</w:t>
+      </w:r>
+    </w:p>
+    <w:p>
+      <w:r>
+        <w:t xml:space="preserve">Üretilen </w:t>
+      </w:r>
+      <w:r>
+        <w:rPr>
+          <w:rFonts w:ascii="Consolas" w:hAnsi="Consolas"/>
+          <w:color w:val="B03060"/>
+          <w:sz w:val="19"/>
+        </w:rPr>
+        <w:t>.ply</w:t>
+      </w:r>
+      <w:r>
+        <w:t xml:space="preserve"> modelleri </w:t>
+      </w:r>
+      <w:r>
+        <w:rPr>
+          <w:rFonts w:ascii="Consolas" w:hAnsi="Consolas"/>
+          <w:color w:val="B03060"/>
+          <w:sz w:val="19"/>
+        </w:rPr>
+        <w:t>models/</w:t>
+      </w:r>
+      <w:r>
+        <w:t xml:space="preserve"> altında Git LFS ile sürümlenir.</w:t>
       </w:r>
     </w:p>
     <w:p>

</xml_diff>

<commit_message>
docs: teslim raporlarini topla
</commit_message>
<xml_diff>
--- a/docs/raporlar/hafta-03_raporu.docx
+++ b/docs/raporlar/hafta-03_raporu.docx
@@ -53,7 +53,7 @@
         <w:pStyle w:val="Heading2"/>
       </w:pPr>
       <w:r>
-        <w:t>1. Amaç</w:t>
+        <w:t>1. Amaç ve Yapılan İş</w:t>
       </w:r>
     </w:p>
     <w:p>
@@ -72,12 +72,16 @@
     </w:p>
     <w:p>
       <w:r>
-        <w:t>Çalışma iki aşamada yürütüldü: önce bir ekip üyesinin odasında hat uçtan uca çalıştırıldı (3 koşu), ardından D207 dersliğinde tek değişkenli kontrollü karşılaştırma yapıldı (12 koşu).</w:t>
-      </w:r>
-    </w:p>
-    <w:p>
-      <w:r>
-        <w:t>Yanıtlanan sorular:</w:t>
+        <w:t xml:space="preserve">Aynı derslik videosu </w:t>
+      </w:r>
+      <w:r>
+        <w:rPr>
+          <w:b/>
+        </w:rPr>
+        <w:t>iki ayrı hatta</w:t>
+      </w:r>
+      <w:r>
+        <w:t xml:space="preserve"> işlendi:</w:t>
       </w:r>
     </w:p>
     <w:tbl>
@@ -88,14 +92,15 @@
         <w:tblLook w:firstColumn="1" w:firstRow="1" w:lastColumn="0" w:lastRow="0" w:noHBand="0" w:noVBand="1" w:val="04A0"/>
       </w:tblPr>
       <w:tblGrid>
-        <w:gridCol w:w="2880"/>
-        <w:gridCol w:w="2880"/>
-        <w:gridCol w:w="2880"/>
+        <w:gridCol w:w="2160"/>
+        <w:gridCol w:w="2160"/>
+        <w:gridCol w:w="2160"/>
+        <w:gridCol w:w="2160"/>
       </w:tblGrid>
       <w:tr>
         <w:tc>
           <w:tcPr>
-            <w:tcW w:type="dxa" w:w="2880"/>
+            <w:tcW w:type="dxa" w:w="2160"/>
           </w:tcPr>
           <w:p>
             <w:r>
@@ -103,13 +108,13 @@
                 <w:b/>
                 <w:sz w:val="18"/>
               </w:rPr>
-              <w:t>#</w:t>
-            </w:r>
-          </w:p>
-        </w:tc>
-        <w:tc>
-          <w:tcPr>
-            <w:tcW w:type="dxa" w:w="2880"/>
+              <w:t>Hat</w:t>
+            </w:r>
+          </w:p>
+        </w:tc>
+        <w:tc>
+          <w:tcPr>
+            <w:tcW w:type="dxa" w:w="2160"/>
           </w:tcPr>
           <w:p>
             <w:r>
@@ -117,13 +122,27 @@
                 <w:b/>
                 <w:sz w:val="18"/>
               </w:rPr>
-              <w:t>Soru</w:t>
-            </w:r>
-          </w:p>
-        </w:tc>
-        <w:tc>
-          <w:tcPr>
-            <w:tcW w:type="dxa" w:w="2880"/>
+              <w:t>Ortam</w:t>
+            </w:r>
+          </w:p>
+        </w:tc>
+        <w:tc>
+          <w:tcPr>
+            <w:tcW w:type="dxa" w:w="2160"/>
+          </w:tcPr>
+          <w:p>
+            <w:r>
+              <w:rPr>
+                <w:b/>
+                <w:sz w:val="18"/>
+              </w:rPr>
+              <w:t>Kapsam</w:t>
+            </w:r>
+          </w:p>
+        </w:tc>
+        <w:tc>
+          <w:tcPr>
+            <w:tcW w:type="dxa" w:w="2160"/>
           </w:tcPr>
           <w:p>
             <w:r>
@@ -139,40 +158,54 @@
       <w:tr>
         <w:tc>
           <w:tcPr>
-            <w:tcW w:type="dxa" w:w="2880"/>
-          </w:tcPr>
-          <w:p>
-            <w:r>
-              <w:rPr>
-                <w:sz w:val="18"/>
-              </w:rPr>
-              <w:t>1</w:t>
-            </w:r>
-          </w:p>
-        </w:tc>
-        <w:tc>
-          <w:tcPr>
-            <w:tcW w:type="dxa" w:w="2880"/>
-          </w:tcPr>
-          <w:p>
-            <w:r>
-              <w:rPr>
-                <w:sz w:val="18"/>
-              </w:rPr>
-              <w:t>COLMAP'in hangi kareleri eşleştireceği seçimi sonucu nasıl etkiler?</w:t>
-            </w:r>
-          </w:p>
-        </w:tc>
-        <w:tc>
-          <w:tcPr>
-            <w:tcW w:type="dxa" w:w="2880"/>
-          </w:tcPr>
-          <w:p>
-            <w:r>
-              <w:rPr>
-                <w:sz w:val="18"/>
-              </w:rPr>
-              <w:t>5.1</w:t>
+            <w:tcW w:type="dxa" w:w="2160"/>
+          </w:tcPr>
+          <w:p>
+            <w:r>
+              <w:rPr>
+                <w:b/>
+                <w:sz w:val="18"/>
+              </w:rPr>
+              <w:t>A — Yerel</w:t>
+            </w:r>
+          </w:p>
+        </w:tc>
+        <w:tc>
+          <w:tcPr>
+            <w:tcW w:type="dxa" w:w="2160"/>
+          </w:tcPr>
+          <w:p>
+            <w:r>
+              <w:rPr>
+                <w:sz w:val="18"/>
+              </w:rPr>
+              <w:t>RTX 2060 6 GB iş istasyonu</w:t>
+            </w:r>
+          </w:p>
+        </w:tc>
+        <w:tc>
+          <w:tcPr>
+            <w:tcW w:type="dxa" w:w="2160"/>
+          </w:tcPr>
+          <w:p>
+            <w:r>
+              <w:rPr>
+                <w:sz w:val="18"/>
+              </w:rPr>
+              <w:t>3 SfM + 9 eğitim koşusu, tek değişkenli kontrollü karşılaştırma</w:t>
+            </w:r>
+          </w:p>
+        </w:tc>
+        <w:tc>
+          <w:tcPr>
+            <w:tcW w:type="dxa" w:w="2160"/>
+          </w:tcPr>
+          <w:p>
+            <w:r>
+              <w:rPr>
+                <w:sz w:val="18"/>
+              </w:rPr>
+              <w:t>5</w:t>
             </w:r>
           </w:p>
         </w:tc>
@@ -180,74 +213,47 @@
       <w:tr>
         <w:tc>
           <w:tcPr>
-            <w:tcW w:type="dxa" w:w="2880"/>
-          </w:tcPr>
-          <w:p>
-            <w:r>
-              <w:rPr>
-                <w:sz w:val="18"/>
-              </w:rPr>
-              <w:t>2</w:t>
-            </w:r>
-          </w:p>
-        </w:tc>
-        <w:tc>
-          <w:tcPr>
-            <w:tcW w:type="dxa" w:w="2880"/>
-          </w:tcPr>
-          <w:p>
-            <w:r>
-              <w:rPr>
-                <w:sz w:val="18"/>
-              </w:rPr>
-              <w:t>Literatürdeki 3DGS iyileştirmeleri ölçülebilir kazanç sağlıyor mu?</w:t>
-            </w:r>
-          </w:p>
-        </w:tc>
-        <w:tc>
-          <w:tcPr>
-            <w:tcW w:type="dxa" w:w="2880"/>
-          </w:tcPr>
-          <w:p>
-            <w:r>
-              <w:rPr>
-                <w:sz w:val="18"/>
-              </w:rPr>
-              <w:t>5.2</w:t>
-            </w:r>
-          </w:p>
-        </w:tc>
-      </w:tr>
-      <w:tr>
-        <w:tc>
-          <w:tcPr>
-            <w:tcW w:type="dxa" w:w="2880"/>
-          </w:tcPr>
-          <w:p>
-            <w:r>
-              <w:rPr>
-                <w:sz w:val="18"/>
-              </w:rPr>
-              <w:t>3</w:t>
-            </w:r>
-          </w:p>
-        </w:tc>
-        <w:tc>
-          <w:tcPr>
-            <w:tcW w:type="dxa" w:w="2880"/>
-          </w:tcPr>
-          <w:p>
-            <w:r>
-              <w:rPr>
-                <w:sz w:val="18"/>
-              </w:rPr>
-              <w:t>6 GB VRAM bu iş için nerede yetersiz kalıyor?</w:t>
-            </w:r>
-          </w:p>
-        </w:tc>
-        <w:tc>
-          <w:tcPr>
-            <w:tcW w:type="dxa" w:w="2880"/>
+            <w:tcW w:type="dxa" w:w="2160"/>
+          </w:tcPr>
+          <w:p>
+            <w:r>
+              <w:rPr>
+                <w:b/>
+                <w:sz w:val="18"/>
+              </w:rPr>
+              <w:t>B — Bulut ve hazır hizmet</w:t>
+            </w:r>
+          </w:p>
+        </w:tc>
+        <w:tc>
+          <w:tcPr>
+            <w:tcW w:type="dxa" w:w="2160"/>
+          </w:tcPr>
+          <w:p>
+            <w:r>
+              <w:rPr>
+                <w:sz w:val="18"/>
+              </w:rPr>
+              <w:t>Google Colab (NVIDIA L4) ve Luma AI</w:t>
+            </w:r>
+          </w:p>
+        </w:tc>
+        <w:tc>
+          <w:tcPr>
+            <w:tcW w:type="dxa" w:w="2160"/>
+          </w:tcPr>
+          <w:p>
+            <w:r>
+              <w:rPr>
+                <w:sz w:val="18"/>
+              </w:rPr>
+              <w:t>2 eğitim koşusu + 1 hazır hizmet, Unity aktarımı</w:t>
+            </w:r>
+          </w:p>
+        </w:tc>
+        <w:tc>
+          <w:tcPr>
+            <w:tcW w:type="dxa" w:w="2160"/>
           </w:tcPr>
           <w:p>
             <w:r>
@@ -255,47 +261,6 @@
                 <w:sz w:val="18"/>
               </w:rPr>
               <w:t>6</w:t>
-            </w:r>
-          </w:p>
-        </w:tc>
-      </w:tr>
-      <w:tr>
-        <w:tc>
-          <w:tcPr>
-            <w:tcW w:type="dxa" w:w="2880"/>
-          </w:tcPr>
-          <w:p>
-            <w:r>
-              <w:rPr>
-                <w:sz w:val="18"/>
-              </w:rPr>
-              <w:t>4</w:t>
-            </w:r>
-          </w:p>
-        </w:tc>
-        <w:tc>
-          <w:tcPr>
-            <w:tcW w:type="dxa" w:w="2880"/>
-          </w:tcPr>
-          <w:p>
-            <w:r>
-              <w:rPr>
-                <w:sz w:val="18"/>
-              </w:rPr>
-              <w:t>Gaussian temsili, NeRF'e göre üstün mü?</w:t>
-            </w:r>
-          </w:p>
-        </w:tc>
-        <w:tc>
-          <w:tcPr>
-            <w:tcW w:type="dxa" w:w="2880"/>
-          </w:tcPr>
-          <w:p>
-            <w:r>
-              <w:rPr>
-                <w:sz w:val="18"/>
-              </w:rPr>
-              <w:t>5.4</w:t>
             </w:r>
           </w:p>
         </w:tc>
@@ -304,7 +269,26 @@
     <w:p/>
     <w:p>
       <w:r>
-        <w:t>Haftanın çıktısı, önerilen yapılandırmayla üretilen derslik modelidir:</w:t>
+        <w:t xml:space="preserve">Bu ayrım raporun tamamında korunmuştur: A hattı kontrollü bir ablasyon çalışması, B hattı ise ortam ve hizmet karşılaştırmasıdır. İki hattın sayısal sonuçları </w:t>
+      </w:r>
+      <w:r>
+        <w:rPr>
+          <w:b/>
+        </w:rPr>
+        <w:t>birbiriyle karşılaştırılamaz</w:t>
+      </w:r>
+      <w:r>
+        <w:t xml:space="preserve"> — kare seti, çözünürlük, test bölmesi ve eşleştirme stratejisi farklıdır. Ortak bulgular 7. bölümde, her maddenin hangi hattan geldiği belirtilerek toplanmıştır.</w:t>
+      </w:r>
+    </w:p>
+    <w:p>
+      <w:r>
+        <w:t>Öncesinde bir ekip üyesinin odasında 3 pilot koşu yapılarak hattın uçtan uca çalıştığı doğrulanmıştır (Bölüm 4.3).</w:t>
+      </w:r>
+    </w:p>
+    <w:p>
+      <w:r>
+        <w:t>Haftanın çıktısı, A hattında önerilen yapılandırmayla üretilen derslik modelidir:</w:t>
       </w:r>
     </w:p>
     <w:p>
@@ -355,7 +339,7 @@
           <w:i/>
           <w:sz w:val="18"/>
         </w:rPr>
-        <w:t>Şekil 1 — Üretilen modelin genel görünümü (önerilen yapılandırma, 30.000 iterasyon). Tavan aydınlatması, projeksiyon, tahtalar, kapı, pencere ve sıralar arasındaki geçiş koridoru ayırt edilebilmektedir.</w:t>
+        <w:t>Şekil 1 — Üretilen modelin genel görünümü (A hattı, önerilen yapılandırma, 30.000 iterasyon). Tavan aydınlatması, projeksiyon, tahtalar, kapı, pencere ve sıralar arasındaki geçiş koridoru ayırt edilebilmektedir.</w:t>
       </w:r>
     </w:p>
     <w:p>
@@ -381,7 +365,7 @@
         <w:br/>
         <w:t>FFmpeg             kamera pozları +        gsplat CUDA             SuperSplat /</w:t>
         <w:br/>
-        <w:t>1 kare/s           seyrek nokta bulutu     rasterizasyonu          Unity</w:t>
+        <w:t xml:space="preserve">                   seyrek nokta bulutu     rasterizasyonu          Unity</w:t>
       </w:r>
     </w:p>
     <w:p>
@@ -458,7 +442,7 @@
                 <w:b/>
                 <w:sz w:val="18"/>
               </w:rPr>
-              <w:t>Sürüm</w:t>
+              <w:t>Sürüm / ortam</w:t>
             </w:r>
           </w:p>
         </w:tc>
@@ -500,7 +484,7 @@
               <w:rPr>
                 <w:sz w:val="18"/>
               </w:rPr>
-              <w:t>3.9.1 CUDA</w:t>
+              <w:t>3.9.1 CUDA (yerel) · CPU (bulut)</w:t>
             </w:r>
           </w:p>
         </w:tc>
@@ -700,7 +684,7 @@
               <w:rPr>
                 <w:sz w:val="18"/>
               </w:rPr>
-              <w:t>Donanım</w:t>
+              <w:t>Unity + UnityGaussianSplatting</w:t>
             </w:r>
           </w:p>
         </w:tc>
@@ -713,6 +697,88 @@
               <w:rPr>
                 <w:sz w:val="18"/>
               </w:rPr>
+              <w:t>URP</w:t>
+            </w:r>
+          </w:p>
+        </w:tc>
+        <w:tc>
+          <w:tcPr>
+            <w:tcW w:type="dxa" w:w="2880"/>
+          </w:tcPr>
+          <w:p>
+            <w:r>
+              <w:rPr>
+                <w:sz w:val="18"/>
+              </w:rPr>
+              <w:t>Modellerin oyun motorunda görüntülenmesi</w:t>
+            </w:r>
+          </w:p>
+        </w:tc>
+      </w:tr>
+      <w:tr>
+        <w:tc>
+          <w:tcPr>
+            <w:tcW w:type="dxa" w:w="2880"/>
+          </w:tcPr>
+          <w:p>
+            <w:r>
+              <w:rPr>
+                <w:sz w:val="18"/>
+              </w:rPr>
+              <w:t>Luma AI</w:t>
+            </w:r>
+          </w:p>
+        </w:tc>
+        <w:tc>
+          <w:tcPr>
+            <w:tcW w:type="dxa" w:w="2880"/>
+          </w:tcPr>
+          <w:p>
+            <w:r>
+              <w:rPr>
+                <w:sz w:val="18"/>
+              </w:rPr>
+              <w:t>hazır bulut hizmeti</w:t>
+            </w:r>
+          </w:p>
+        </w:tc>
+        <w:tc>
+          <w:tcPr>
+            <w:tcW w:type="dxa" w:w="2880"/>
+          </w:tcPr>
+          <w:p>
+            <w:r>
+              <w:rPr>
+                <w:sz w:val="18"/>
+              </w:rPr>
+              <w:t>Kapalı kutu 3DGS üretimi</w:t>
+            </w:r>
+          </w:p>
+        </w:tc>
+      </w:tr>
+      <w:tr>
+        <w:tc>
+          <w:tcPr>
+            <w:tcW w:type="dxa" w:w="2880"/>
+          </w:tcPr>
+          <w:p>
+            <w:r>
+              <w:rPr>
+                <w:sz w:val="18"/>
+              </w:rPr>
+              <w:t>Donanım (A)</w:t>
+            </w:r>
+          </w:p>
+        </w:tc>
+        <w:tc>
+          <w:tcPr>
+            <w:tcW w:type="dxa" w:w="2880"/>
+          </w:tcPr>
+          <w:p>
+            <w:r>
+              <w:rPr>
+                <w:sz w:val="18"/>
+              </w:rPr>
               <w:t>RTX 2060 6 GB · Ryzen 5 3500X · 16 GB RAM</w:t>
             </w:r>
           </w:p>
@@ -726,7 +792,48 @@
               <w:rPr>
                 <w:sz w:val="18"/>
               </w:rPr>
-              <w:t>—</w:t>
+              <w:t>Yerel eğitim</w:t>
+            </w:r>
+          </w:p>
+        </w:tc>
+      </w:tr>
+      <w:tr>
+        <w:tc>
+          <w:tcPr>
+            <w:tcW w:type="dxa" w:w="2880"/>
+          </w:tcPr>
+          <w:p>
+            <w:r>
+              <w:rPr>
+                <w:sz w:val="18"/>
+              </w:rPr>
+              <w:t>Donanım (B)</w:t>
+            </w:r>
+          </w:p>
+        </w:tc>
+        <w:tc>
+          <w:tcPr>
+            <w:tcW w:type="dxa" w:w="2880"/>
+          </w:tcPr>
+          <w:p>
+            <w:r>
+              <w:rPr>
+                <w:sz w:val="18"/>
+              </w:rPr>
+              <w:t>Google Colab, NVIDIA L4</w:t>
+            </w:r>
+          </w:p>
+        </w:tc>
+        <w:tc>
+          <w:tcPr>
+            <w:tcW w:type="dxa" w:w="2880"/>
+          </w:tcPr>
+          <w:p>
+            <w:r>
+              <w:rPr>
+                <w:sz w:val="18"/>
+              </w:rPr>
+              <w:t>Bulut eğitim</w:t>
             </w:r>
           </w:p>
         </w:tc>
@@ -734,11 +841,27 @@
     </w:tbl>
     <w:p/>
     <w:p>
+      <w:r>
+        <w:rPr>
+          <w:b/>
+        </w:rPr>
+        <w:t>Ortalama iz uzunluğu</w:t>
+      </w:r>
+      <w:r>
+        <w:t>, bir 3B noktanın kaç görüntüde gözlendiğini verir ve bu çalışmada çoklu görünüm örtüşmesinin birincil göstergesi olarak kullanılmıştır.</w:t>
+      </w:r>
+    </w:p>
+    <w:p>
       <w:pPr>
         <w:pStyle w:val="Heading2"/>
       </w:pPr>
       <w:r>
         <w:t>3. Veri</w:t>
+      </w:r>
+    </w:p>
+    <w:p>
+      <w:r>
+        <w:t>Her iki hat da aynı ham videoyu kullanır; kare örneklemesi farklıdır.</w:t>
       </w:r>
     </w:p>
     <w:tbl>
@@ -846,9 +969,10 @@
           <w:p>
             <w:r>
               <w:rPr>
-                <w:sz w:val="18"/>
-              </w:rPr>
-              <w:t>Kullanılan kare</w:t>
+                <w:b/>
+                <w:sz w:val="18"/>
+              </w:rPr>
+              <w:t>A hattı örneklemesi</w:t>
             </w:r>
           </w:p>
         </w:tc>
@@ -857,12 +981,6 @@
             <w:tcW w:type="dxa" w:w="4320"/>
           </w:tcPr>
           <w:p>
-            <w:r>
-              <w:rPr>
-                <w:sz w:val="18"/>
-              </w:rPr>
-              <w:t xml:space="preserve">FFmpeg </w:t>
-            </w:r>
             <w:r>
               <w:rPr>
                 <w:rFonts w:ascii="Consolas" w:hAnsi="Consolas"/>
@@ -888,7 +1006,57 @@
               <w:rPr>
                 <w:sz w:val="18"/>
               </w:rPr>
-              <w:t xml:space="preserve"> (dikey 1080×1920)</w:t>
+              <w:t>, dikey 1080×1920</w:t>
+            </w:r>
+          </w:p>
+        </w:tc>
+      </w:tr>
+      <w:tr>
+        <w:tc>
+          <w:tcPr>
+            <w:tcW w:type="dxa" w:w="4320"/>
+          </w:tcPr>
+          <w:p>
+            <w:r>
+              <w:rPr>
+                <w:b/>
+                <w:sz w:val="18"/>
+              </w:rPr>
+              <w:t>B hattı örneklemesi</w:t>
+            </w:r>
+          </w:p>
+        </w:tc>
+        <w:tc>
+          <w:tcPr>
+            <w:tcW w:type="dxa" w:w="4320"/>
+          </w:tcPr>
+          <w:p>
+            <w:r>
+              <w:rPr>
+                <w:rFonts w:ascii="Consolas" w:hAnsi="Consolas"/>
+                <w:color w:val="B03060"/>
+                <w:sz w:val="18"/>
+              </w:rPr>
+              <w:t>fps=3</w:t>
+            </w:r>
+            <w:r>
+              <w:rPr>
+                <w:sz w:val="18"/>
+              </w:rPr>
+              <w:t xml:space="preserve"> → </w:t>
+            </w:r>
+            <w:r>
+              <w:rPr>
+                <w:b/>
+                <w:sz w:val="18"/>
+              </w:rPr>
+              <w:t>1.047 kare</w:t>
+            </w:r>
+            <w:r>
+              <w:rPr>
+                <w:sz w:val="18"/>
+              </w:rPr>
+              <w:t>, uzun kenar 1.600 px'e küçültülmüş</w:t>
             </w:r>
           </w:p>
         </w:tc>
@@ -900,10 +1068,15 @@
         <w:rPr>
           <w:b/>
         </w:rPr>
-        <w:t>Neden 349 kare?</w:t>
+        <w:t>Neden tüm kareler kullanılmıyor?</w:t>
       </w:r>
       <w:r>
         <w:t xml:space="preserve"> 29,97 FPS'te ardışık iki kare arası, yürüme hızında yalnızca 2–3 cm kamera ötelemesine karşılık gelir; derinlik üçgenlemesi için bu paralaks yetersizdir. Saniyede bir karede mesafe 0,5–1 metreye çıkar. Ayrıca tam eşleştirmede karşılaştırma sayısı kare sayısının karesiyle büyür: 349 kare 60.726 çift, 10.459 kare ise 54,7 milyon çift demektir.</w:t>
+      </w:r>
+    </w:p>
+    <w:p>
+      <w:r>
+        <w:t>B hattında kareler üç kat sık alınmış, her üç adaydan Laplacian varyansı en yüksek olan tutulmuştur. COLMAP bu ortamda CPU'da çalıştığı için görüntüler küçültülmüştür.</w:t>
       </w:r>
     </w:p>
     <w:p>
@@ -911,7 +1084,7 @@
         <w:rPr>
           <w:b/>
         </w:rPr>
-        <w:t>Kare kalitesi.</w:t>
+        <w:t>Kare kalitesi (A hattı).</w:t>
       </w:r>
       <w:r>
         <w:t xml:space="preserve"> Laplacian varyansı ile ölçülen netlik medyanı 205; eşik 100'ün altında kalan </w:t>
@@ -923,7 +1096,7 @@
         <w:t>34 kare (%9,7)</w:t>
       </w:r>
       <w:r>
-        <w:t xml:space="preserve"> bulunmaktadır. Bu karelerde hareket bulanıklığı ve dokusuz beyaz duvar birlikte görülmektedir — iç mekânlarda dokusuz yüzeyin rekonstrüksiyonu zorlaştırdığı FreeSplat [05] çalışmasında da bildirilmektedir.</w:t>
+        <w:t xml:space="preserve"> bulunmaktadır. Bu karelerde hareket bulanıklığı ve dokusuz beyaz duvar birlikte görülmektedir — iç mekânlarda dokusuz yüzeyin rekonstrüksiyonu zorlaştırdığı FreeSplat [05] çalışmasında da bildirilmektedir. B hattında çözünürlük farklı olduğundan netlik değerleri (en az 9, ortalama 81) A hattıyla karşılaştırılamaz.</w:t>
       </w:r>
     </w:p>
     <w:p>
@@ -978,6 +1151,62 @@
       </w:r>
     </w:p>
     <w:p>
+      <w:r>
+        <w:t>Laplacian varyansı bulanıklık ile dokusuzluğu ayırmaz; her ikisi de düşük değer üretir. Bu nedenle ölçüt eleme değil, işaretleme amacıyla kullanılmıştır.</w:t>
+      </w:r>
+    </w:p>
+    <w:p>
+      <w:pPr>
+        <w:jc w:val="center"/>
+      </w:pPr>
+      <w:r>
+        <w:drawing>
+          <wp:inline xmlns:a="http://schemas.openxmlformats.org/drawingml/2006/main" xmlns:pic="http://schemas.openxmlformats.org/drawingml/2006/picture">
+            <wp:extent cx="5486400" cy="3858768"/>
+            <wp:docPr id="3" name="Picture 3"/>
+            <wp:cNvGraphicFramePr>
+              <a:graphicFrameLocks noChangeAspect="1"/>
+            </wp:cNvGraphicFramePr>
+            <a:graphic>
+              <a:graphicData uri="http://schemas.openxmlformats.org/drawingml/2006/picture">
+                <pic:pic>
+                  <pic:nvPicPr>
+                    <pic:cNvPr id="0" name="sekil3_kamera_yolu.jpg"/>
+                    <pic:cNvPicPr/>
+                  </pic:nvPicPr>
+                  <pic:blipFill>
+                    <a:blip r:embed="rId11"/>
+                    <a:stretch>
+                      <a:fillRect/>
+                    </a:stretch>
+                  </pic:blipFill>
+                  <pic:spPr>
+                    <a:xfrm>
+                      <a:off x="0" y="0"/>
+                      <a:ext cx="5486400" cy="3858768"/>
+                    </a:xfrm>
+                    <a:prstGeom prst="rect"/>
+                  </pic:spPr>
+                </pic:pic>
+              </a:graphicData>
+            </a:graphic>
+          </wp:inline>
+        </w:drawing>
+      </w:r>
+    </w:p>
+    <w:p>
+      <w:pPr>
+        <w:jc w:val="center"/>
+      </w:pPr>
+      <w:r>
+        <w:rPr>
+          <w:i/>
+          <w:sz w:val="18"/>
+        </w:rPr>
+        <w:t>Şekil 3 — Çekim güzergâhı. Her piramit bir kamera konumudur; sıraların çevresi dolaşılmış, duvar boyunca ilerlenmiştir.</w:t>
+      </w:r>
+    </w:p>
+    <w:p>
       <w:pPr>
         <w:pStyle w:val="Heading2"/>
       </w:pPr>
@@ -990,7 +1219,366 @@
         <w:pStyle w:val="Heading3"/>
       </w:pPr>
       <w:r>
-        <w:t>4.1 Oda denemeleri ve çıkarılan dersler</w:t>
+        <w:t>4.1 A hattı — kontrollü karşılaştırma</w:t>
+      </w:r>
+    </w:p>
+    <w:p>
+      <w:r>
+        <w:t xml:space="preserve">Yerel eğitim koşularının tamamı </w:t>
+      </w:r>
+      <w:r>
+        <w:rPr>
+          <w:b/>
+        </w:rPr>
+        <w:t>tek ve aynı SfM çıktısını</w:t>
+      </w:r>
+      <w:r>
+        <w:t xml:space="preserve"> kullanır: </w:t>
+      </w:r>
+      <w:r>
+        <w:rPr>
+          <w:rFonts w:ascii="Consolas" w:hAnsi="Consolas"/>
+          <w:color w:val="B03060"/>
+          <w:sz w:val="19"/>
+        </w:rPr>
+        <w:t>exhaustive</w:t>
+      </w:r>
+      <w:r>
+        <w:t xml:space="preserve"> eşleştirmeyle üretilen 331 kare, tek COLMAP modeli, 298 eğitim / 33 test bölünmesi. Her koşuda varsayılana göre </w:t>
+      </w:r>
+      <w:r>
+        <w:rPr>
+          <w:b/>
+        </w:rPr>
+        <w:t>yalnızca bir ayar</w:t>
+      </w:r>
+      <w:r>
+        <w:t xml:space="preserve"> değişir. Ablasyonlar 15.000, doğrulama koşuları 30.000 iterasyonla çalıştırılmıştır. Metrikler </w:t>
+      </w:r>
+      <w:r>
+        <w:rPr>
+          <w:rFonts w:ascii="Consolas" w:hAnsi="Consolas"/>
+          <w:color w:val="B03060"/>
+          <w:sz w:val="19"/>
+        </w:rPr>
+        <w:t>ns-eval</w:t>
+      </w:r>
+      <w:r>
+        <w:t xml:space="preserve"> ile ayrılmış test karelerinde ölçülmüştür.</w:t>
+      </w:r>
+    </w:p>
+    <w:p>
+      <w:pPr>
+        <w:pStyle w:val="Heading3"/>
+      </w:pPr>
+      <w:r>
+        <w:t>4.2 B hattı — ortam ve hizmet karşılaştırması</w:t>
+      </w:r>
+    </w:p>
+    <w:p>
+      <w:r>
+        <w:t xml:space="preserve">Bu koşular A hattıyla aynı kontrol altında </w:t>
+      </w:r>
+      <w:r>
+        <w:rPr>
+          <w:b/>
+        </w:rPr>
+        <w:t>değildir</w:t>
+      </w:r>
+      <w:r>
+        <w:t>; amaç ortam ve hizmet karşılaştırmasıdır.</w:t>
+      </w:r>
+    </w:p>
+    <w:tbl>
+      <w:tblPr>
+        <w:tblStyle w:val="LightGrid-Accent1"/>
+        <w:tblW w:type="auto" w:w="0"/>
+        <w:jc w:val="center"/>
+        <w:tblLook w:firstColumn="1" w:firstRow="1" w:lastColumn="0" w:lastRow="0" w:noHBand="0" w:noVBand="1" w:val="04A0"/>
+      </w:tblPr>
+      <w:tblGrid>
+        <w:gridCol w:w="2160"/>
+        <w:gridCol w:w="2160"/>
+        <w:gridCol w:w="2160"/>
+        <w:gridCol w:w="2160"/>
+      </w:tblGrid>
+      <w:tr>
+        <w:tc>
+          <w:tcPr>
+            <w:tcW w:type="dxa" w:w="2160"/>
+          </w:tcPr>
+          <w:p>
+            <w:r>
+              <w:rPr>
+                <w:b/>
+                <w:sz w:val="18"/>
+              </w:rPr>
+              <w:t>Koşu</w:t>
+            </w:r>
+          </w:p>
+        </w:tc>
+        <w:tc>
+          <w:tcPr>
+            <w:tcW w:type="dxa" w:w="2160"/>
+          </w:tcPr>
+          <w:p>
+            <w:r>
+              <w:rPr>
+                <w:b/>
+                <w:sz w:val="18"/>
+              </w:rPr>
+              <w:t>Ortam</w:t>
+            </w:r>
+          </w:p>
+        </w:tc>
+        <w:tc>
+          <w:tcPr>
+            <w:tcW w:type="dxa" w:w="2160"/>
+          </w:tcPr>
+          <w:p>
+            <w:r>
+              <w:rPr>
+                <w:b/>
+                <w:sz w:val="18"/>
+              </w:rPr>
+              <w:t>SfM</w:t>
+            </w:r>
+          </w:p>
+        </w:tc>
+        <w:tc>
+          <w:tcPr>
+            <w:tcW w:type="dxa" w:w="2160"/>
+          </w:tcPr>
+          <w:p>
+            <w:r>
+              <w:rPr>
+                <w:b/>
+                <w:sz w:val="18"/>
+              </w:rPr>
+              <w:t>Eğitim</w:t>
+            </w:r>
+          </w:p>
+        </w:tc>
+      </w:tr>
+      <w:tr>
+        <w:tc>
+          <w:tcPr>
+            <w:tcW w:type="dxa" w:w="2160"/>
+          </w:tcPr>
+          <w:p>
+            <w:r>
+              <w:rPr>
+                <w:b/>
+                <w:sz w:val="18"/>
+              </w:rPr>
+              <w:t>C1</w:t>
+            </w:r>
+          </w:p>
+        </w:tc>
+        <w:tc>
+          <w:tcPr>
+            <w:tcW w:type="dxa" w:w="2160"/>
+          </w:tcPr>
+          <w:p>
+            <w:r>
+              <w:rPr>
+                <w:sz w:val="18"/>
+              </w:rPr>
+              <w:t>Colab, NVIDIA L4</w:t>
+            </w:r>
+          </w:p>
+        </w:tc>
+        <w:tc>
+          <w:tcPr>
+            <w:tcW w:type="dxa" w:w="2160"/>
+          </w:tcPr>
+          <w:p>
+            <w:r>
+              <w:rPr>
+                <w:sz w:val="18"/>
+              </w:rPr>
+              <w:t xml:space="preserve">1.047 kare, </w:t>
+            </w:r>
+            <w:r>
+              <w:rPr>
+                <w:rFonts w:ascii="Consolas" w:hAnsi="Consolas"/>
+                <w:color w:val="B03060"/>
+                <w:sz w:val="18"/>
+              </w:rPr>
+              <w:t>sequential</w:t>
+            </w:r>
+            <w:r>
+              <w:rPr>
+                <w:sz w:val="18"/>
+              </w:rPr>
+              <w:t>, CPU; ana model 823 kare</w:t>
+            </w:r>
+          </w:p>
+        </w:tc>
+        <w:tc>
+          <w:tcPr>
+            <w:tcW w:type="dxa" w:w="2160"/>
+          </w:tcPr>
+          <w:p>
+            <w:r>
+              <w:rPr>
+                <w:rFonts w:ascii="Consolas" w:hAnsi="Consolas"/>
+                <w:color w:val="B03060"/>
+                <w:sz w:val="18"/>
+              </w:rPr>
+              <w:t>splatfacto</w:t>
+            </w:r>
+            <w:r>
+              <w:rPr>
+                <w:sz w:val="18"/>
+              </w:rPr>
+              <w:t>, 30.000 iterasyon</w:t>
+            </w:r>
+          </w:p>
+        </w:tc>
+      </w:tr>
+      <w:tr>
+        <w:tc>
+          <w:tcPr>
+            <w:tcW w:type="dxa" w:w="2160"/>
+          </w:tcPr>
+          <w:p>
+            <w:r>
+              <w:rPr>
+                <w:b/>
+                <w:sz w:val="18"/>
+              </w:rPr>
+              <w:t>C2</w:t>
+            </w:r>
+          </w:p>
+        </w:tc>
+        <w:tc>
+          <w:tcPr>
+            <w:tcW w:type="dxa" w:w="2160"/>
+          </w:tcPr>
+          <w:p>
+            <w:r>
+              <w:rPr>
+                <w:sz w:val="18"/>
+              </w:rPr>
+              <w:t>Colab, NVIDIA L4</w:t>
+            </w:r>
+          </w:p>
+        </w:tc>
+        <w:tc>
+          <w:tcPr>
+            <w:tcW w:type="dxa" w:w="2160"/>
+          </w:tcPr>
+          <w:p>
+            <w:r>
+              <w:rPr>
+                <w:sz w:val="18"/>
+              </w:rPr>
+              <w:t>C1 ile aynı SfM çıktısı</w:t>
+            </w:r>
+          </w:p>
+        </w:tc>
+        <w:tc>
+          <w:tcPr>
+            <w:tcW w:type="dxa" w:w="2160"/>
+          </w:tcPr>
+          <w:p>
+            <w:r>
+              <w:rPr>
+                <w:rFonts w:ascii="Consolas" w:hAnsi="Consolas"/>
+                <w:color w:val="B03060"/>
+                <w:sz w:val="18"/>
+              </w:rPr>
+              <w:t>splatfacto-big</w:t>
+            </w:r>
+            <w:r>
+              <w:rPr>
+                <w:sz w:val="18"/>
+              </w:rPr>
+              <w:t xml:space="preserve"> + ölçek düzenlemesi, 30.000 iterasyon</w:t>
+            </w:r>
+          </w:p>
+        </w:tc>
+      </w:tr>
+      <w:tr>
+        <w:tc>
+          <w:tcPr>
+            <w:tcW w:type="dxa" w:w="2160"/>
+          </w:tcPr>
+          <w:p>
+            <w:r>
+              <w:rPr>
+                <w:b/>
+                <w:sz w:val="18"/>
+              </w:rPr>
+              <w:t>L1</w:t>
+            </w:r>
+          </w:p>
+        </w:tc>
+        <w:tc>
+          <w:tcPr>
+            <w:tcW w:type="dxa" w:w="2160"/>
+          </w:tcPr>
+          <w:p>
+            <w:r>
+              <w:rPr>
+                <w:sz w:val="18"/>
+              </w:rPr>
+              <w:t>Luma AI</w:t>
+            </w:r>
+          </w:p>
+        </w:tc>
+        <w:tc>
+          <w:tcPr>
+            <w:tcW w:type="dxa" w:w="2160"/>
+          </w:tcPr>
+          <w:p>
+            <w:r>
+              <w:rPr>
+                <w:sz w:val="18"/>
+              </w:rPr>
+              <w:t>hizmet içinde, görünmez</w:t>
+            </w:r>
+          </w:p>
+        </w:tc>
+        <w:tc>
+          <w:tcPr>
+            <w:tcW w:type="dxa" w:w="2160"/>
+          </w:tcPr>
+          <w:p>
+            <w:r>
+              <w:rPr>
+                <w:sz w:val="18"/>
+              </w:rPr>
+              <w:t>hizmet içinde, görünmez</w:t>
+            </w:r>
+          </w:p>
+        </w:tc>
+      </w:tr>
+    </w:tbl>
+    <w:p/>
+    <w:p>
+      <w:r>
+        <w:t xml:space="preserve">C2'nin </w:t>
+      </w:r>
+      <w:r>
+        <w:rPr>
+          <w:rFonts w:ascii="Consolas" w:hAnsi="Consolas"/>
+          <w:color w:val="B03060"/>
+          <w:sz w:val="19"/>
+        </w:rPr>
+        <w:t>splatfacto-big</w:t>
+      </w:r>
+      <w:r>
+        <w:t xml:space="preserve"> olduğu, iki eşik değerinin bu yapılandırmanın varsayılanlarıyla eşleşmesinden doğrulanmıştır.</w:t>
+      </w:r>
+    </w:p>
+    <w:p>
+      <w:pPr>
+        <w:pStyle w:val="Heading3"/>
+      </w:pPr>
+      <w:r>
+        <w:t>4.3 Oda denemeleri ve çıkarılan dersler</w:t>
       </w:r>
     </w:p>
     <w:p>
@@ -1355,7 +1943,7 @@
     <w:p/>
     <w:p>
       <w:r>
-        <w:t>Sınıf çalışmasına geçmeden önce düzeltilenler:</w:t>
+        <w:t>Derslik çalışmasına geçmeden önce düzeltilenler:</w:t>
       </w:r>
     </w:p>
     <w:tbl>
@@ -1450,7 +2038,7 @@
               <w:rPr>
                 <w:sz w:val="18"/>
               </w:rPr>
-              <w:t xml:space="preserve">%10 test ayrımı (298 / 33 kare), </w:t>
+              <w:t xml:space="preserve">%10 test ayrımı, </w:t>
             </w:r>
             <w:r>
               <w:rPr>
@@ -1588,7 +2176,7 @@
         <w:pStyle w:val="Heading3"/>
       </w:pPr>
       <w:r>
-        <w:t>4.2 Üretim hattında bulunan hata</w:t>
+        <w:t>4.4 Her iki ortamda görülen üretim hattı hatası</w:t>
       </w:r>
     </w:p>
     <w:p>
@@ -1615,16 +2203,111 @@
         <w:t>colmap/sparse/0</w:t>
       </w:r>
       <w:r>
-        <w:t xml:space="preserve"> klasöründen üretir. COLMAP sahneyi parçaladığında en büyük model orada olmak zorunda değildir: sınıf verisinde </w:t>
-      </w:r>
+        <w:t xml:space="preserve"> klasöründen üretir. COLMAP sahneyi parçaladığında en büyük model orada olmak zorunda değildir:</w:t>
+      </w:r>
+    </w:p>
+    <w:p>
+      <w:pPr>
+        <w:pStyle w:val="ListBullet"/>
+      </w:pPr>
       <w:r>
         <w:rPr>
           <w:b/>
         </w:rPr>
-        <w:t>331 görüntülük model `sparse/1`'e, 2 görüntülük dejenere artık `sparse/0`'a</w:t>
-      </w:r>
-      <w:r>
-        <w:t xml:space="preserve"> yazılmıştı. İlk eğitim denemesi farkına varılmadan 2 kare üzerinde koştu ve ancak değerlendirme aşamasında yakalandı. Bu kontrol üretim hattının zorunlu adımı hâline getirildi (</w:t>
+        <w:t>A hattında</w:t>
+      </w:r>
+      <w:r>
+        <w:t xml:space="preserve"> 331 görüntülük model </w:t>
+      </w:r>
+      <w:r>
+        <w:rPr>
+          <w:rFonts w:ascii="Consolas" w:hAnsi="Consolas"/>
+          <w:color w:val="B03060"/>
+          <w:sz w:val="19"/>
+        </w:rPr>
+        <w:t>sparse/1</w:t>
+      </w:r>
+      <w:r>
+        <w:t>'e, 2 görüntülük dejenere artık</w:t>
+      </w:r>
+    </w:p>
+    <w:p>
+      <w:r>
+        <w:rPr>
+          <w:rFonts w:ascii="Consolas" w:hAnsi="Consolas"/>
+          <w:color w:val="B03060"/>
+          <w:sz w:val="19"/>
+        </w:rPr>
+        <w:t>sparse/0</w:t>
+      </w:r>
+      <w:r>
+        <w:t>'a yazılmıştı. İlk eğitim denemesi farkına varılmadan 2 kare üzerinde koştu ve ancak değerlendirme aşamasında yakalandı.</w:t>
+      </w:r>
+    </w:p>
+    <w:p>
+      <w:pPr>
+        <w:pStyle w:val="ListBullet"/>
+      </w:pPr>
+      <w:r>
+        <w:rPr>
+          <w:b/>
+        </w:rPr>
+        <w:t>B hattında</w:t>
+      </w:r>
+      <w:r>
+        <w:t xml:space="preserve"> aynı hata bağımsız olarak görüldü: COLMAP beş model üretti, 823</w:t>
+      </w:r>
+    </w:p>
+    <w:p>
+      <w:r>
+        <w:t xml:space="preserve">görüntülük ana model </w:t>
+      </w:r>
+      <w:r>
+        <w:rPr>
+          <w:rFonts w:ascii="Consolas" w:hAnsi="Consolas"/>
+          <w:color w:val="B03060"/>
+          <w:sz w:val="19"/>
+        </w:rPr>
+        <w:t>sparse/1</w:t>
+      </w:r>
+      <w:r>
+        <w:t xml:space="preserve">'de, 2 görüntülük artık </w:t>
+      </w:r>
+      <w:r>
+        <w:rPr>
+          <w:rFonts w:ascii="Consolas" w:hAnsi="Consolas"/>
+          <w:color w:val="B03060"/>
+          <w:sz w:val="19"/>
+        </w:rPr>
+        <w:t>sparse/0</w:t>
+      </w:r>
+      <w:r>
+        <w:t xml:space="preserve">'da idi ve ilk </w:t>
+      </w:r>
+      <w:r>
+        <w:rPr>
+          <w:rFonts w:ascii="Consolas" w:hAnsi="Consolas"/>
+          <w:color w:val="B03060"/>
+          <w:sz w:val="19"/>
+        </w:rPr>
+        <w:t>transforms.json</w:t>
+      </w:r>
+      <w:r>
+        <w:t xml:space="preserve"> yalnızca 2 poz içeriyordu.</w:t>
+      </w:r>
+    </w:p>
+    <w:p>
+      <w:r>
+        <w:t xml:space="preserve">Her iki ortamda bağımsız olarak ortaya çıkması, bunun tesadüf değil </w:t>
+      </w:r>
+      <w:r>
+        <w:rPr>
+          <w:b/>
+        </w:rPr>
+        <w:t>hattın yapısal bir tuzağı</w:t>
+      </w:r>
+      <w:r>
+        <w:t xml:space="preserve"> olduğunu gösterir. Eğitimden önce kare sayısının doğrulanması zorunlu adım hâline getirilmiştir (</w:t>
       </w:r>
       <w:r>
         <w:rPr>
@@ -1635,29 +2318,7 @@
         <w:t>scripts/fix_transforms.py</w:t>
       </w:r>
       <w:r>
-        <w:t>).</w:t>
-      </w:r>
-    </w:p>
-    <w:p>
-      <w:pPr>
-        <w:pStyle w:val="Heading3"/>
-      </w:pPr>
-      <w:r>
-        <w:t>4.3 Deneysel kontrol</w:t>
-      </w:r>
-    </w:p>
-    <w:p>
-      <w:r>
-        <w:t xml:space="preserve">Tüm eğitim koşuları </w:t>
-      </w:r>
-      <w:r>
-        <w:rPr>
-          <w:b/>
-        </w:rPr>
-        <w:t>tek ve aynı SfM çıktısını</w:t>
-      </w:r>
-      <w:r>
-        <w:t xml:space="preserve"> kullanır: </w:t>
+        <w:t xml:space="preserve">; B hattında </w:t>
       </w:r>
       <w:r>
         <w:rPr>
@@ -1665,10 +2326,10 @@
           <w:color w:val="B03060"/>
           <w:sz w:val="19"/>
         </w:rPr>
-        <w:t>exhaustive</w:t>
-      </w:r>
-      <w:r>
-        <w:t xml:space="preserve"> eşleştirmeyle üretilen 331 kare, tek COLMAP modeli, 298 eğitim / 33 test bölünmesi. Her koşuda varsayılana göre yalnızca bir ayar değişir. Ablasyonlar 15.000, doğrulama koşuları 30.000 iterasyonla çalıştırılmıştır.</w:t>
+        <w:t>--skip-colmap --colmap-model-path colmap/sparse/1</w:t>
+      </w:r>
+      <w:r>
+        <w:t>).</w:t>
       </w:r>
     </w:p>
     <w:p>
@@ -1676,7 +2337,7 @@
         <w:pStyle w:val="Heading2"/>
       </w:pPr>
       <w:r>
-        <w:t>5. Sonuçlar</w:t>
+        <w:t>5. A Hattı — Yerel Koşuların Sonuçları</w:t>
       </w:r>
     </w:p>
     <w:p>
@@ -2237,6 +2898,28 @@
       </w:r>
       <w:r>
         <w:t xml:space="preserve"> ile aynı kayıt oranını üretti, ancak eşleştirmesi daha uzun sürdü. Sözlük kurma ve sorgulama maliyeti, 349 karede 60.726 çifti doğrudan karşılaştırmaktan pahalıya gelmektedir.</w:t>
+      </w:r>
+    </w:p>
+    <w:p>
+      <w:r>
+        <w:rPr>
+          <w:b/>
+        </w:rPr>
+        <w:t>Seçim:</w:t>
+      </w:r>
+      <w:r>
+        <w:t xml:space="preserve"> Tüm yerel eğitim koşuları </w:t>
+      </w:r>
+      <w:r>
+        <w:rPr>
+          <w:rFonts w:ascii="Consolas" w:hAnsi="Consolas"/>
+          <w:color w:val="B03060"/>
+          <w:sz w:val="19"/>
+        </w:rPr>
+        <w:t>exhaustive</w:t>
+      </w:r>
+      <w:r>
+        <w:t xml:space="preserve"> çıktısı üzerinde yapılmıştır.</w:t>
       </w:r>
     </w:p>
     <w:p>
@@ -3043,7 +3726,7 @@
         <w:drawing>
           <wp:inline xmlns:a="http://schemas.openxmlformats.org/drawingml/2006/main" xmlns:pic="http://schemas.openxmlformats.org/drawingml/2006/picture">
             <wp:extent cx="5486400" cy="1373681"/>
-            <wp:docPr id="3" name="Picture 3"/>
+            <wp:docPr id="4" name="Picture 4"/>
             <wp:cNvGraphicFramePr>
               <a:graphicFrameLocks noChangeAspect="1"/>
             </wp:cNvGraphicFramePr>
@@ -3055,7 +3738,7 @@
                     <pic:cNvPicPr/>
                   </pic:nvPicPr>
                   <pic:blipFill>
-                    <a:blip r:embed="rId11"/>
+                    <a:blip r:embed="rId12"/>
                     <a:stretch>
                       <a:fillRect/>
                     </a:stretch>
@@ -3083,7 +3766,7 @@
           <w:i/>
           <w:sz w:val="18"/>
         </w:rPr>
-        <w:t>Şekil 3 — Eğitim ilerleyişi (aynı kamera). Sıralar önce bulanık kütleler hâlinde, sonra kenarları oturmuş ve dokusu netleşmiş durumda.</w:t>
+        <w:t>Şekil 4 — Eğitim ilerleyişi (aynı kamera). Sıralar önce bulanık kütleler hâlinde, sonra kenarları oturmuş ve dokusu netleşmiş durumda.</w:t>
       </w:r>
     </w:p>
     <w:p>
@@ -3639,7 +4322,7 @@
         <w:drawing>
           <wp:inline xmlns:a="http://schemas.openxmlformats.org/drawingml/2006/main" xmlns:pic="http://schemas.openxmlformats.org/drawingml/2006/picture">
             <wp:extent cx="5486400" cy="2114026"/>
-            <wp:docPr id="4" name="Picture 4"/>
+            <wp:docPr id="5" name="Picture 5"/>
             <wp:cNvGraphicFramePr>
               <a:graphicFrameLocks noChangeAspect="1"/>
             </wp:cNvGraphicFramePr>
@@ -3651,7 +4334,7 @@
                     <pic:cNvPicPr/>
                   </pic:nvPicPr>
                   <pic:blipFill>
-                    <a:blip r:embed="rId12"/>
+                    <a:blip r:embed="rId13"/>
                     <a:stretch>
                       <a:fillRect/>
                     </a:stretch>
@@ -3679,7 +4362,7 @@
           <w:i/>
           <w:sz w:val="18"/>
         </w:rPr>
-        <w:t>Şekil 4 — Önerilen yapılandırmayla üretilen modelden iki ek görünüm.</w:t>
+        <w:t>Şekil 5 — Önerilen yapılandırmayla üretilen modelden iki ek görünüm.</w:t>
       </w:r>
     </w:p>
     <w:p>
@@ -4080,7 +4763,7 @@
         <w:drawing>
           <wp:inline xmlns:a="http://schemas.openxmlformats.org/drawingml/2006/main" xmlns:pic="http://schemas.openxmlformats.org/drawingml/2006/picture">
             <wp:extent cx="5486400" cy="15230246"/>
-            <wp:docPr id="5" name="Picture 5"/>
+            <wp:docPr id="6" name="Picture 6"/>
             <wp:cNvGraphicFramePr>
               <a:graphicFrameLocks noChangeAspect="1"/>
             </wp:cNvGraphicFramePr>
@@ -4092,7 +4775,7 @@
                     <pic:cNvPicPr/>
                   </pic:nvPicPr>
                   <pic:blipFill>
-                    <a:blip r:embed="rId13"/>
+                    <a:blip r:embed="rId14"/>
                     <a:stretch>
                       <a:fillRect/>
                     </a:stretch>
@@ -4120,28 +4803,12 @@
           <w:i/>
           <w:sz w:val="18"/>
         </w:rPr>
-        <w:t>Şekil 5 — Aynı test kamerası, üç yöntem. G2 keskin ve hizalı; G4'ün render'ı net olmasına karşın sahne gerçek fotoğrafa göre ötelenmiş; G7 (NeRF) sahneyi kurmuş ama sıra kenarları birbirine karışmış durumda.</w:t>
+        <w:t>Şekil 6 — Aynı test kamerası, üç yöntem. G2 keskin ve hizalı; G4'ün render'ı net olmasına karşın sahne gerçek fotoğrafa göre ötelenmiş; G7 (NeRF) sahneyi kurmuş ama sıra kenarları birbirine karışmış durumda.</w:t>
       </w:r>
     </w:p>
     <w:p>
       <w:r>
-        <w:t>NeRF serbest 3B bakışta sahne bütünlüğünü (duvar, tavan, pencereler) kurmuştur; zayıflığı kenar keskinliğindedir. Bu ayrım erişilebilirlik ölçümü açısından belirleyicidir: geçit genişliği ölçmek keskin yüzey kenarı gerektirir.</w:t>
-      </w:r>
-    </w:p>
-    <w:p>
-      <w:r>
-        <w:t>Yöntem seçiminin ikinci ve bu ölçümden bağımsız gerekçesi aktarımdır: Unity görüntüleyicisi (</w:t>
-      </w:r>
-      <w:r>
-        <w:rPr>
-          <w:rFonts w:ascii="Consolas" w:hAnsi="Consolas"/>
-          <w:color w:val="B03060"/>
-          <w:sz w:val="19"/>
-        </w:rPr>
-        <w:t>UnityGaussianSplatting</w:t>
-      </w:r>
-      <w:r>
-        <w:t xml:space="preserve">) ve VR hattı Gaussian temsili gerektirir; NeRF modeli </w:t>
+        <w:t xml:space="preserve">NeRF serbest 3B bakışta sahne bütünlüğünü (duvar, tavan, pencereler) kurmuştur; zayıflığı kenar keskinliğindedir. Yöntem seçiminin ikinci ve bu ölçümden bağımsız gerekçesi aktarımdır: Unity görüntüleyicisi ve VR hattı Gaussian temsili gerektirir; NeRF modeli </w:t>
       </w:r>
       <w:r>
         <w:rPr>
@@ -4157,21 +4824,56 @@
     </w:p>
     <w:p>
       <w:pPr>
+        <w:ind w:left="504"/>
+      </w:pPr>
+      <w:r>
+        <w:rPr>
+          <w:rFonts w:ascii="Consolas" w:hAnsi="Consolas"/>
+          <w:color w:val="B03060"/>
+          <w:sz w:val="19"/>
+        </w:rPr>
+        <w:t>nerfacto</w:t>
+      </w:r>
+      <w:r>
+        <w:rPr>
+          <w:sz w:val="19"/>
+        </w:rPr>
+        <w:t xml:space="preserve"> ölçümü </w:t>
+      </w:r>
+      <w:r>
+        <w:rPr>
+          <w:rFonts w:ascii="Consolas" w:hAnsi="Consolas"/>
+          <w:color w:val="B03060"/>
+          <w:sz w:val="19"/>
+        </w:rPr>
+        <w:t>tiny-cuda-nn</w:t>
+      </w:r>
+      <w:r>
+        <w:rPr>
+          <w:sz w:val="19"/>
+        </w:rPr>
+        <w:t xml:space="preserve"> kurulduktan sonra alınmıştır. Kütüphane kurulmadan adım süresi 1.470 ms, kurulduktan sonra 48 ms ölçülmüştür (yaklaşık 30 kat).</w:t>
+      </w:r>
+    </w:p>
+    <w:p>
+      <w:pPr>
         <w:pStyle w:val="Heading2"/>
       </w:pPr>
       <w:r>
-        <w:t>6. Bulgular</w:t>
+        <w:t>6. B Hattı — Bulut ve Hazır Hizmet Sonuçları</w:t>
       </w:r>
     </w:p>
     <w:p>
-      <w:r>
-        <w:rPr>
-          <w:b/>
-        </w:rPr>
-        <w:t>1. Örtüşme, kare sayısından daha belirleyicidir.</w:t>
-      </w:r>
-      <w:r>
-        <w:t xml:space="preserve"> </w:t>
+      <w:pPr>
+        <w:pStyle w:val="Heading3"/>
+      </w:pPr>
+      <w:r>
+        <w:t>6.1 SfM: bulut ortamında sahne parçalanması</w:t>
+      </w:r>
+    </w:p>
+    <w:p>
+      <w:r>
+        <w:t xml:space="preserve">Bulut koşusu </w:t>
       </w:r>
       <w:r>
         <w:rPr>
@@ -4182,7 +4884,1204 @@
         <w:t>sequential</w:t>
       </w:r>
       <w:r>
-        <w:t xml:space="preserve"> ile </w:t>
+        <w:t xml:space="preserve"> eşleştirmeyle ve üç kat sık örneklenmiş 1.047 kareyle yapıldı. Karelerin %94,8'i (993) bir modele yerleşti, ancak sahne </w:t>
+      </w:r>
+      <w:r>
+        <w:rPr>
+          <w:b/>
+        </w:rPr>
+        <w:t>beş parçaya bölündü</w:t>
+      </w:r>
+      <w:r>
+        <w:t xml:space="preserve"> ve en büyük model karelerin yalnızca </w:t>
+      </w:r>
+      <w:r>
+        <w:rPr>
+          <w:b/>
+        </w:rPr>
+        <w:t>%78,6'sını (823)</w:t>
+      </w:r>
+      <w:r>
+        <w:t xml:space="preserve"> kapsadı.</w:t>
+      </w:r>
+    </w:p>
+    <w:tbl>
+      <w:tblPr>
+        <w:tblStyle w:val="LightGrid-Accent1"/>
+        <w:tblW w:type="auto" w:w="0"/>
+        <w:jc w:val="center"/>
+        <w:tblLook w:firstColumn="1" w:firstRow="1" w:lastColumn="0" w:lastRow="0" w:noHBand="0" w:noVBand="1" w:val="04A0"/>
+      </w:tblPr>
+      <w:tblGrid>
+        <w:gridCol w:w="2160"/>
+        <w:gridCol w:w="2160"/>
+        <w:gridCol w:w="2160"/>
+        <w:gridCol w:w="2160"/>
+      </w:tblGrid>
+      <w:tr>
+        <w:tc>
+          <w:tcPr>
+            <w:tcW w:type="dxa" w:w="2160"/>
+          </w:tcPr>
+          <w:p>
+            <w:r>
+              <w:rPr>
+                <w:b/>
+                <w:sz w:val="18"/>
+              </w:rPr>
+              <w:t>Bulut SfM modeli</w:t>
+            </w:r>
+          </w:p>
+        </w:tc>
+        <w:tc>
+          <w:tcPr>
+            <w:tcW w:type="dxa" w:w="2160"/>
+          </w:tcPr>
+          <w:p>
+            <w:r>
+              <w:rPr>
+                <w:b/>
+                <w:sz w:val="18"/>
+              </w:rPr>
+              <w:t>Kayıtlı kare</w:t>
+            </w:r>
+          </w:p>
+        </w:tc>
+        <w:tc>
+          <w:tcPr>
+            <w:tcW w:type="dxa" w:w="2160"/>
+          </w:tcPr>
+          <w:p>
+            <w:r>
+              <w:rPr>
+                <w:b/>
+                <w:sz w:val="18"/>
+              </w:rPr>
+              <w:t>3B nokta</w:t>
+            </w:r>
+          </w:p>
+        </w:tc>
+        <w:tc>
+          <w:tcPr>
+            <w:tcW w:type="dxa" w:w="2160"/>
+          </w:tcPr>
+          <w:p>
+            <w:r>
+              <w:rPr>
+                <w:b/>
+                <w:sz w:val="18"/>
+              </w:rPr>
+              <w:t>Yeniden izdüşüm hatası</w:t>
+            </w:r>
+          </w:p>
+        </w:tc>
+      </w:tr>
+      <w:tr>
+        <w:tc>
+          <w:tcPr>
+            <w:tcW w:type="dxa" w:w="2160"/>
+          </w:tcPr>
+          <w:p>
+            <w:r>
+              <w:rPr>
+                <w:b/>
+                <w:sz w:val="18"/>
+              </w:rPr>
+              <w:t>Model 1 (ana)</w:t>
+            </w:r>
+          </w:p>
+        </w:tc>
+        <w:tc>
+          <w:tcPr>
+            <w:tcW w:type="dxa" w:w="2160"/>
+          </w:tcPr>
+          <w:p>
+            <w:r>
+              <w:rPr>
+                <w:b/>
+                <w:sz w:val="18"/>
+              </w:rPr>
+              <w:t>823</w:t>
+            </w:r>
+          </w:p>
+        </w:tc>
+        <w:tc>
+          <w:tcPr>
+            <w:tcW w:type="dxa" w:w="2160"/>
+          </w:tcPr>
+          <w:p>
+            <w:r>
+              <w:rPr>
+                <w:sz w:val="18"/>
+              </w:rPr>
+              <w:t>250.782</w:t>
+            </w:r>
+          </w:p>
+        </w:tc>
+        <w:tc>
+          <w:tcPr>
+            <w:tcW w:type="dxa" w:w="2160"/>
+          </w:tcPr>
+          <w:p>
+            <w:r>
+              <w:rPr>
+                <w:sz w:val="18"/>
+              </w:rPr>
+              <w:t>0,57 px</w:t>
+            </w:r>
+          </w:p>
+        </w:tc>
+      </w:tr>
+      <w:tr>
+        <w:tc>
+          <w:tcPr>
+            <w:tcW w:type="dxa" w:w="2160"/>
+          </w:tcPr>
+          <w:p>
+            <w:r>
+              <w:rPr>
+                <w:sz w:val="18"/>
+              </w:rPr>
+              <w:t>Model 2</w:t>
+            </w:r>
+          </w:p>
+        </w:tc>
+        <w:tc>
+          <w:tcPr>
+            <w:tcW w:type="dxa" w:w="2160"/>
+          </w:tcPr>
+          <w:p>
+            <w:r>
+              <w:rPr>
+                <w:sz w:val="18"/>
+              </w:rPr>
+              <w:t>64</w:t>
+            </w:r>
+          </w:p>
+        </w:tc>
+        <w:tc>
+          <w:tcPr>
+            <w:tcW w:type="dxa" w:w="2160"/>
+          </w:tcPr>
+          <w:p>
+            <w:r>
+              <w:rPr>
+                <w:sz w:val="18"/>
+              </w:rPr>
+              <w:t>28.173</w:t>
+            </w:r>
+          </w:p>
+        </w:tc>
+        <w:tc>
+          <w:tcPr>
+            <w:tcW w:type="dxa" w:w="2160"/>
+          </w:tcPr>
+          <w:p>
+            <w:r>
+              <w:rPr>
+                <w:sz w:val="18"/>
+              </w:rPr>
+              <w:t>0,57 px</w:t>
+            </w:r>
+          </w:p>
+        </w:tc>
+      </w:tr>
+      <w:tr>
+        <w:tc>
+          <w:tcPr>
+            <w:tcW w:type="dxa" w:w="2160"/>
+          </w:tcPr>
+          <w:p>
+            <w:r>
+              <w:rPr>
+                <w:sz w:val="18"/>
+              </w:rPr>
+              <w:t>Model 4</w:t>
+            </w:r>
+          </w:p>
+        </w:tc>
+        <w:tc>
+          <w:tcPr>
+            <w:tcW w:type="dxa" w:w="2160"/>
+          </w:tcPr>
+          <w:p>
+            <w:r>
+              <w:rPr>
+                <w:sz w:val="18"/>
+              </w:rPr>
+              <w:t>57</w:t>
+            </w:r>
+          </w:p>
+        </w:tc>
+        <w:tc>
+          <w:tcPr>
+            <w:tcW w:type="dxa" w:w="2160"/>
+          </w:tcPr>
+          <w:p>
+            <w:r>
+              <w:rPr>
+                <w:sz w:val="18"/>
+              </w:rPr>
+              <w:t>7.240</w:t>
+            </w:r>
+          </w:p>
+        </w:tc>
+        <w:tc>
+          <w:tcPr>
+            <w:tcW w:type="dxa" w:w="2160"/>
+          </w:tcPr>
+          <w:p>
+            <w:r>
+              <w:rPr>
+                <w:sz w:val="18"/>
+              </w:rPr>
+              <w:t>0,67 px</w:t>
+            </w:r>
+          </w:p>
+        </w:tc>
+      </w:tr>
+      <w:tr>
+        <w:tc>
+          <w:tcPr>
+            <w:tcW w:type="dxa" w:w="2160"/>
+          </w:tcPr>
+          <w:p>
+            <w:r>
+              <w:rPr>
+                <w:sz w:val="18"/>
+              </w:rPr>
+              <w:t>Model 3</w:t>
+            </w:r>
+          </w:p>
+        </w:tc>
+        <w:tc>
+          <w:tcPr>
+            <w:tcW w:type="dxa" w:w="2160"/>
+          </w:tcPr>
+          <w:p>
+            <w:r>
+              <w:rPr>
+                <w:sz w:val="18"/>
+              </w:rPr>
+              <w:t>47</w:t>
+            </w:r>
+          </w:p>
+        </w:tc>
+        <w:tc>
+          <w:tcPr>
+            <w:tcW w:type="dxa" w:w="2160"/>
+          </w:tcPr>
+          <w:p>
+            <w:r>
+              <w:rPr>
+                <w:sz w:val="18"/>
+              </w:rPr>
+              <w:t>3.345</w:t>
+            </w:r>
+          </w:p>
+        </w:tc>
+        <w:tc>
+          <w:tcPr>
+            <w:tcW w:type="dxa" w:w="2160"/>
+          </w:tcPr>
+          <w:p>
+            <w:r>
+              <w:rPr>
+                <w:sz w:val="18"/>
+              </w:rPr>
+              <w:t>0,70 px</w:t>
+            </w:r>
+          </w:p>
+        </w:tc>
+      </w:tr>
+      <w:tr>
+        <w:tc>
+          <w:tcPr>
+            <w:tcW w:type="dxa" w:w="2160"/>
+          </w:tcPr>
+          <w:p>
+            <w:r>
+              <w:rPr>
+                <w:sz w:val="18"/>
+              </w:rPr>
+              <w:t>Model 0 (artık)</w:t>
+            </w:r>
+          </w:p>
+        </w:tc>
+        <w:tc>
+          <w:tcPr>
+            <w:tcW w:type="dxa" w:w="2160"/>
+          </w:tcPr>
+          <w:p>
+            <w:r>
+              <w:rPr>
+                <w:sz w:val="18"/>
+              </w:rPr>
+              <w:t>2</w:t>
+            </w:r>
+          </w:p>
+        </w:tc>
+        <w:tc>
+          <w:tcPr>
+            <w:tcW w:type="dxa" w:w="2160"/>
+          </w:tcPr>
+          <w:p>
+            <w:r>
+              <w:rPr>
+                <w:sz w:val="18"/>
+              </w:rPr>
+              <w:t>2.862</w:t>
+            </w:r>
+          </w:p>
+        </w:tc>
+        <w:tc>
+          <w:tcPr>
+            <w:tcW w:type="dxa" w:w="2160"/>
+          </w:tcPr>
+          <w:p>
+            <w:r>
+              <w:rPr>
+                <w:sz w:val="18"/>
+              </w:rPr>
+              <w:t>0,21 px</w:t>
+            </w:r>
+          </w:p>
+        </w:tc>
+      </w:tr>
+    </w:tbl>
+    <w:p/>
+    <w:p>
+      <w:pPr>
+        <w:jc w:val="center"/>
+      </w:pPr>
+      <w:r>
+        <w:drawing>
+          <wp:inline xmlns:a="http://schemas.openxmlformats.org/drawingml/2006/main" xmlns:pic="http://schemas.openxmlformats.org/drawingml/2006/picture">
+            <wp:extent cx="5486400" cy="1988820"/>
+            <wp:docPr id="7" name="Picture 7"/>
+            <wp:cNvGraphicFramePr>
+              <a:graphicFrameLocks noChangeAspect="1"/>
+            </wp:cNvGraphicFramePr>
+            <a:graphic>
+              <a:graphicData uri="http://schemas.openxmlformats.org/drawingml/2006/picture">
+                <pic:pic>
+                  <pic:nvPicPr>
+                    <pic:cNvPr id="0" name="sekil7_bulut_colmap_kapsam.png"/>
+                    <pic:cNvPicPr/>
+                  </pic:nvPicPr>
+                  <pic:blipFill>
+                    <a:blip r:embed="rId15"/>
+                    <a:stretch>
+                      <a:fillRect/>
+                    </a:stretch>
+                  </pic:blipFill>
+                  <pic:spPr>
+                    <a:xfrm>
+                      <a:off x="0" y="0"/>
+                      <a:ext cx="5486400" cy="1988820"/>
+                    </a:xfrm>
+                    <a:prstGeom prst="rect"/>
+                  </pic:spPr>
+                </pic:pic>
+              </a:graphicData>
+            </a:graphic>
+          </wp:inline>
+        </w:drawing>
+      </w:r>
+    </w:p>
+    <w:p>
+      <w:pPr>
+        <w:jc w:val="center"/>
+      </w:pPr>
+      <w:r>
+        <w:rPr>
+          <w:i/>
+          <w:sz w:val="18"/>
+        </w:rPr>
+        <w:t>Şekil 7 — Bulut hattında COLMAP modellerinin video zamanına göre kapsamı. Ana model videonun ilk 3:48'ini kesintisiz kapsar; zincir yaklaşık 4:07, 4:34 ve 5:09'da kopmuştur.</w:t>
+      </w:r>
+    </w:p>
+    <w:p>
+      <w:r>
+        <w:t xml:space="preserve">Kopma noktalarındaki kareler incelendiğinde </w:t>
+      </w:r>
+      <w:r>
+        <w:rPr>
+          <w:b/>
+        </w:rPr>
+        <w:t>sandalye ve sıra altına çok yakın çekimler</w:t>
+      </w:r>
+      <w:r>
+        <w:t xml:space="preserve"> (4:07–4:10) ile </w:t>
+      </w:r>
+      <w:r>
+        <w:rPr>
+          <w:b/>
+        </w:rPr>
+        <w:t>neredeyse boş beyaz duvar görünümleri</w:t>
+      </w:r>
+      <w:r>
+        <w:t xml:space="preserve"> (4:35, 5:11) dikkat çekmektedir. Kareleri sık almak kayıt oranını artırdı, parçalanmayı önlemedi.</w:t>
+      </w:r>
+    </w:p>
+    <w:p>
+      <w:r>
+        <w:t>COLMAP bu ortamda CUDA desteği olmadan çalıştığı için SfM uzun sürdü: özellik çıkarma 7,2 dk, eşleştirme ~40 dk, haritalama ~50 dk (toplam ~1,5 saat).</w:t>
+      </w:r>
+    </w:p>
+    <w:p>
+      <w:r>
+        <w:t>Eğitim koşuları ana model (823 kare) üzerinde yapılmıştır.</w:t>
+      </w:r>
+    </w:p>
+    <w:p>
+      <w:pPr>
+        <w:pStyle w:val="Heading3"/>
+      </w:pPr>
+      <w:r>
+        <w:t>6.2 Eğitim ve hazır hizmet</w:t>
+      </w:r>
+    </w:p>
+    <w:tbl>
+      <w:tblPr>
+        <w:tblStyle w:val="LightGrid-Accent1"/>
+        <w:tblW w:type="auto" w:w="0"/>
+        <w:jc w:val="center"/>
+        <w:tblLook w:firstColumn="1" w:firstRow="1" w:lastColumn="0" w:lastRow="0" w:noHBand="0" w:noVBand="1" w:val="04A0"/>
+      </w:tblPr>
+      <w:tblGrid>
+        <w:gridCol w:w="2160"/>
+        <w:gridCol w:w="2160"/>
+        <w:gridCol w:w="2160"/>
+        <w:gridCol w:w="2160"/>
+      </w:tblGrid>
+      <w:tr>
+        <w:tc>
+          <w:tcPr>
+            <w:tcW w:type="dxa" w:w="2160"/>
+          </w:tcPr>
+          <w:p>
+            <w:r>
+              <w:rPr>
+                <w:b/>
+                <w:sz w:val="18"/>
+              </w:rPr>
+              <w:t>Ölçüt</w:t>
+            </w:r>
+          </w:p>
+        </w:tc>
+        <w:tc>
+          <w:tcPr>
+            <w:tcW w:type="dxa" w:w="2160"/>
+          </w:tcPr>
+          <w:p>
+            <w:r>
+              <w:rPr>
+                <w:b/>
+                <w:sz w:val="18"/>
+              </w:rPr>
+              <w:t xml:space="preserve">C1 </w:t>
+            </w:r>
+            <w:r>
+              <w:rPr>
+                <w:rFonts w:ascii="Consolas" w:hAnsi="Consolas"/>
+                <w:b/>
+                <w:color w:val="B03060"/>
+                <w:sz w:val="18"/>
+              </w:rPr>
+              <w:t>splatfacto</w:t>
+            </w:r>
+          </w:p>
+        </w:tc>
+        <w:tc>
+          <w:tcPr>
+            <w:tcW w:type="dxa" w:w="2160"/>
+          </w:tcPr>
+          <w:p>
+            <w:r>
+              <w:rPr>
+                <w:b/>
+                <w:sz w:val="18"/>
+              </w:rPr>
+              <w:t xml:space="preserve">C2 </w:t>
+            </w:r>
+            <w:r>
+              <w:rPr>
+                <w:rFonts w:ascii="Consolas" w:hAnsi="Consolas"/>
+                <w:b/>
+                <w:color w:val="B03060"/>
+                <w:sz w:val="18"/>
+              </w:rPr>
+              <w:t>splatfacto-big</w:t>
+            </w:r>
+            <w:r>
+              <w:rPr>
+                <w:b/>
+                <w:sz w:val="18"/>
+              </w:rPr>
+              <w:t xml:space="preserve"> + ölçek düz.</w:t>
+            </w:r>
+          </w:p>
+        </w:tc>
+        <w:tc>
+          <w:tcPr>
+            <w:tcW w:type="dxa" w:w="2160"/>
+          </w:tcPr>
+          <w:p>
+            <w:r>
+              <w:rPr>
+                <w:b/>
+                <w:sz w:val="18"/>
+              </w:rPr>
+              <w:t>L1 Luma AI</w:t>
+            </w:r>
+          </w:p>
+        </w:tc>
+      </w:tr>
+      <w:tr>
+        <w:tc>
+          <w:tcPr>
+            <w:tcW w:type="dxa" w:w="2160"/>
+          </w:tcPr>
+          <w:p>
+            <w:r>
+              <w:rPr>
+                <w:sz w:val="18"/>
+              </w:rPr>
+              <w:t>Eğitimdeki kare</w:t>
+            </w:r>
+          </w:p>
+        </w:tc>
+        <w:tc>
+          <w:tcPr>
+            <w:tcW w:type="dxa" w:w="2160"/>
+          </w:tcPr>
+          <w:p>
+            <w:r>
+              <w:rPr>
+                <w:sz w:val="18"/>
+              </w:rPr>
+              <w:t>823</w:t>
+            </w:r>
+          </w:p>
+        </w:tc>
+        <w:tc>
+          <w:tcPr>
+            <w:tcW w:type="dxa" w:w="2160"/>
+          </w:tcPr>
+          <w:p>
+            <w:r>
+              <w:rPr>
+                <w:sz w:val="18"/>
+              </w:rPr>
+              <w:t>823</w:t>
+            </w:r>
+          </w:p>
+        </w:tc>
+        <w:tc>
+          <w:tcPr>
+            <w:tcW w:type="dxa" w:w="2160"/>
+          </w:tcPr>
+          <w:p>
+            <w:r>
+              <w:rPr>
+                <w:sz w:val="18"/>
+              </w:rPr>
+              <w:t>bilinmiyor</w:t>
+            </w:r>
+          </w:p>
+        </w:tc>
+      </w:tr>
+      <w:tr>
+        <w:tc>
+          <w:tcPr>
+            <w:tcW w:type="dxa" w:w="2160"/>
+          </w:tcPr>
+          <w:p>
+            <w:r>
+              <w:rPr>
+                <w:rFonts w:ascii="Consolas" w:hAnsi="Consolas"/>
+                <w:color w:val="B03060"/>
+                <w:sz w:val="18"/>
+              </w:rPr>
+              <w:t>cull_alpha_thresh</w:t>
+            </w:r>
+          </w:p>
+        </w:tc>
+        <w:tc>
+          <w:tcPr>
+            <w:tcW w:type="dxa" w:w="2160"/>
+          </w:tcPr>
+          <w:p>
+            <w:r>
+              <w:rPr>
+                <w:sz w:val="18"/>
+              </w:rPr>
+              <w:t>0,1</w:t>
+            </w:r>
+          </w:p>
+        </w:tc>
+        <w:tc>
+          <w:tcPr>
+            <w:tcW w:type="dxa" w:w="2160"/>
+          </w:tcPr>
+          <w:p>
+            <w:r>
+              <w:rPr>
+                <w:sz w:val="18"/>
+              </w:rPr>
+              <w:t>0,005</w:t>
+            </w:r>
+          </w:p>
+        </w:tc>
+        <w:tc>
+          <w:tcPr>
+            <w:tcW w:type="dxa" w:w="2160"/>
+          </w:tcPr>
+          <w:p>
+            <w:r>
+              <w:rPr>
+                <w:sz w:val="18"/>
+              </w:rPr>
+              <w:t>—</w:t>
+            </w:r>
+          </w:p>
+        </w:tc>
+      </w:tr>
+      <w:tr>
+        <w:tc>
+          <w:tcPr>
+            <w:tcW w:type="dxa" w:w="2160"/>
+          </w:tcPr>
+          <w:p>
+            <w:r>
+              <w:rPr>
+                <w:rFonts w:ascii="Consolas" w:hAnsi="Consolas"/>
+                <w:color w:val="B03060"/>
+                <w:sz w:val="18"/>
+              </w:rPr>
+              <w:t>densify_grad_thresh</w:t>
+            </w:r>
+          </w:p>
+        </w:tc>
+        <w:tc>
+          <w:tcPr>
+            <w:tcW w:type="dxa" w:w="2160"/>
+          </w:tcPr>
+          <w:p>
+            <w:r>
+              <w:rPr>
+                <w:sz w:val="18"/>
+              </w:rPr>
+              <w:t>0,0008</w:t>
+            </w:r>
+          </w:p>
+        </w:tc>
+        <w:tc>
+          <w:tcPr>
+            <w:tcW w:type="dxa" w:w="2160"/>
+          </w:tcPr>
+          <w:p>
+            <w:r>
+              <w:rPr>
+                <w:sz w:val="18"/>
+              </w:rPr>
+              <w:t>0,0005</w:t>
+            </w:r>
+          </w:p>
+        </w:tc>
+        <w:tc>
+          <w:tcPr>
+            <w:tcW w:type="dxa" w:w="2160"/>
+          </w:tcPr>
+          <w:p>
+            <w:r>
+              <w:rPr>
+                <w:sz w:val="18"/>
+              </w:rPr>
+              <w:t>—</w:t>
+            </w:r>
+          </w:p>
+        </w:tc>
+      </w:tr>
+      <w:tr>
+        <w:tc>
+          <w:tcPr>
+            <w:tcW w:type="dxa" w:w="2160"/>
+          </w:tcPr>
+          <w:p>
+            <w:r>
+              <w:rPr>
+                <w:sz w:val="18"/>
+              </w:rPr>
+              <w:t>Gaussian</w:t>
+            </w:r>
+          </w:p>
+        </w:tc>
+        <w:tc>
+          <w:tcPr>
+            <w:tcW w:type="dxa" w:w="2160"/>
+          </w:tcPr>
+          <w:p>
+            <w:r>
+              <w:rPr>
+                <w:sz w:val="18"/>
+              </w:rPr>
+              <w:t>634.243</w:t>
+            </w:r>
+          </w:p>
+        </w:tc>
+        <w:tc>
+          <w:tcPr>
+            <w:tcW w:type="dxa" w:w="2160"/>
+          </w:tcPr>
+          <w:p>
+            <w:r>
+              <w:rPr>
+                <w:sz w:val="18"/>
+              </w:rPr>
+              <w:t>1.258.471</w:t>
+            </w:r>
+          </w:p>
+        </w:tc>
+        <w:tc>
+          <w:tcPr>
+            <w:tcW w:type="dxa" w:w="2160"/>
+          </w:tcPr>
+          <w:p>
+            <w:r>
+              <w:rPr>
+                <w:sz w:val="18"/>
+              </w:rPr>
+              <w:t>1.068.282</w:t>
+            </w:r>
+          </w:p>
+        </w:tc>
+      </w:tr>
+      <w:tr>
+        <w:tc>
+          <w:tcPr>
+            <w:tcW w:type="dxa" w:w="2160"/>
+          </w:tcPr>
+          <w:p>
+            <w:r>
+              <w:rPr>
+                <w:sz w:val="18"/>
+              </w:rPr>
+              <w:t>Model dosyası</w:t>
+            </w:r>
+          </w:p>
+        </w:tc>
+        <w:tc>
+          <w:tcPr>
+            <w:tcW w:type="dxa" w:w="2160"/>
+          </w:tcPr>
+          <w:p>
+            <w:r>
+              <w:rPr>
+                <w:sz w:val="18"/>
+              </w:rPr>
+              <w:t>157 MB</w:t>
+            </w:r>
+          </w:p>
+        </w:tc>
+        <w:tc>
+          <w:tcPr>
+            <w:tcW w:type="dxa" w:w="2160"/>
+          </w:tcPr>
+          <w:p>
+            <w:r>
+              <w:rPr>
+                <w:sz w:val="18"/>
+              </w:rPr>
+              <w:t>312 MB</w:t>
+            </w:r>
+          </w:p>
+        </w:tc>
+        <w:tc>
+          <w:tcPr>
+            <w:tcW w:type="dxa" w:w="2160"/>
+          </w:tcPr>
+          <w:p>
+            <w:r>
+              <w:rPr>
+                <w:sz w:val="18"/>
+              </w:rPr>
+              <w:t>ölçülmedi</w:t>
+            </w:r>
+          </w:p>
+        </w:tc>
+      </w:tr>
+      <w:tr>
+        <w:tc>
+          <w:tcPr>
+            <w:tcW w:type="dxa" w:w="2160"/>
+          </w:tcPr>
+          <w:p>
+            <w:r>
+              <w:rPr>
+                <w:sz w:val="18"/>
+              </w:rPr>
+              <w:t>PSNR</w:t>
+            </w:r>
+          </w:p>
+        </w:tc>
+        <w:tc>
+          <w:tcPr>
+            <w:tcW w:type="dxa" w:w="2160"/>
+          </w:tcPr>
+          <w:p>
+            <w:r>
+              <w:rPr>
+                <w:sz w:val="18"/>
+              </w:rPr>
+              <w:t>27,16 dB</w:t>
+            </w:r>
+          </w:p>
+        </w:tc>
+        <w:tc>
+          <w:tcPr>
+            <w:tcW w:type="dxa" w:w="2160"/>
+          </w:tcPr>
+          <w:p>
+            <w:r>
+              <w:rPr>
+                <w:sz w:val="18"/>
+              </w:rPr>
+              <w:t>26,78 dB</w:t>
+            </w:r>
+          </w:p>
+        </w:tc>
+        <w:tc>
+          <w:tcPr>
+            <w:tcW w:type="dxa" w:w="2160"/>
+          </w:tcPr>
+          <w:p>
+            <w:r>
+              <w:rPr>
+                <w:sz w:val="18"/>
+              </w:rPr>
+              <w:t>ölçülemez</w:t>
+            </w:r>
+          </w:p>
+        </w:tc>
+      </w:tr>
+      <w:tr>
+        <w:tc>
+          <w:tcPr>
+            <w:tcW w:type="dxa" w:w="2160"/>
+          </w:tcPr>
+          <w:p>
+            <w:r>
+              <w:rPr>
+                <w:sz w:val="18"/>
+              </w:rPr>
+              <w:t>SSIM</w:t>
+            </w:r>
+          </w:p>
+        </w:tc>
+        <w:tc>
+          <w:tcPr>
+            <w:tcW w:type="dxa" w:w="2160"/>
+          </w:tcPr>
+          <w:p>
+            <w:r>
+              <w:rPr>
+                <w:sz w:val="18"/>
+              </w:rPr>
+              <w:t>0,8923</w:t>
+            </w:r>
+          </w:p>
+        </w:tc>
+        <w:tc>
+          <w:tcPr>
+            <w:tcW w:type="dxa" w:w="2160"/>
+          </w:tcPr>
+          <w:p>
+            <w:r>
+              <w:rPr>
+                <w:sz w:val="18"/>
+              </w:rPr>
+              <w:t>0,8924</w:t>
+            </w:r>
+          </w:p>
+        </w:tc>
+        <w:tc>
+          <w:tcPr>
+            <w:tcW w:type="dxa" w:w="2160"/>
+          </w:tcPr>
+          <w:p>
+            <w:r>
+              <w:rPr>
+                <w:sz w:val="18"/>
+              </w:rPr>
+              <w:t>—</w:t>
+            </w:r>
+          </w:p>
+        </w:tc>
+      </w:tr>
+      <w:tr>
+        <w:tc>
+          <w:tcPr>
+            <w:tcW w:type="dxa" w:w="2160"/>
+          </w:tcPr>
+          <w:p>
+            <w:r>
+              <w:rPr>
+                <w:sz w:val="18"/>
+              </w:rPr>
+              <w:t>LPIPS</w:t>
+            </w:r>
+          </w:p>
+        </w:tc>
+        <w:tc>
+          <w:tcPr>
+            <w:tcW w:type="dxa" w:w="2160"/>
+          </w:tcPr>
+          <w:p>
+            <w:r>
+              <w:rPr>
+                <w:sz w:val="18"/>
+              </w:rPr>
+              <w:t>0,2842</w:t>
+            </w:r>
+          </w:p>
+        </w:tc>
+        <w:tc>
+          <w:tcPr>
+            <w:tcW w:type="dxa" w:w="2160"/>
+          </w:tcPr>
+          <w:p>
+            <w:r>
+              <w:rPr>
+                <w:sz w:val="18"/>
+              </w:rPr>
+              <w:t>0,2810</w:t>
+            </w:r>
+          </w:p>
+        </w:tc>
+        <w:tc>
+          <w:tcPr>
+            <w:tcW w:type="dxa" w:w="2160"/>
+          </w:tcPr>
+          <w:p>
+            <w:r>
+              <w:rPr>
+                <w:sz w:val="18"/>
+              </w:rPr>
+              <w:t>—</w:t>
+            </w:r>
+          </w:p>
+        </w:tc>
+      </w:tr>
+      <w:tr>
+        <w:tc>
+          <w:tcPr>
+            <w:tcW w:type="dxa" w:w="2160"/>
+          </w:tcPr>
+          <w:p>
+            <w:r>
+              <w:rPr>
+                <w:sz w:val="18"/>
+              </w:rPr>
+              <w:t>Unity'de gezinme</w:t>
+            </w:r>
+          </w:p>
+        </w:tc>
+        <w:tc>
+          <w:tcPr>
+            <w:tcW w:type="dxa" w:w="2160"/>
+          </w:tcPr>
+          <w:p>
+            <w:r>
+              <w:rPr>
+                <w:sz w:val="18"/>
+              </w:rPr>
+              <w:t>zor, yoğun floater</w:t>
+            </w:r>
+          </w:p>
+        </w:tc>
+        <w:tc>
+          <w:tcPr>
+            <w:tcW w:type="dxa" w:w="2160"/>
+          </w:tcPr>
+          <w:p>
+            <w:r>
+              <w:rPr>
+                <w:sz w:val="18"/>
+              </w:rPr>
+              <w:t>zor, yoğun floater</w:t>
+            </w:r>
+          </w:p>
+        </w:tc>
+        <w:tc>
+          <w:tcPr>
+            <w:tcW w:type="dxa" w:w="2160"/>
+          </w:tcPr>
+          <w:p>
+            <w:r>
+              <w:rPr>
+                <w:sz w:val="18"/>
+              </w:rPr>
+              <w:t>kolay, temiz</w:t>
+            </w:r>
+          </w:p>
+        </w:tc>
+      </w:tr>
+    </w:tbl>
+    <w:p/>
+    <w:p>
+      <w:r>
+        <w:t xml:space="preserve">Bulut ölçümleri 900×1600 çözünürlükte ve Nerfstudio'nun varsayılan test bölmesiyle alınmıştır; </w:t>
+      </w:r>
+      <w:r>
+        <w:rPr>
+          <w:b/>
+        </w:rPr>
+        <w:t>Bölüm 5'teki değerlerle karşılaştırılamaz.</w:t>
+      </w:r>
+    </w:p>
+    <w:p>
+      <w:r>
+        <w:t>C2 ölçümde kazanç getirmedi (PSNR −0,38 dB, SSIM aynı, LPIPS −0,003) ama Gaussian sayısını ve dosya boyutunu yaklaşık iki katına çıkardı. C2'de üç ayar birlikte değiştiği için etki ayrıştırılamaz; sonuç A hattındaki tek değişkenli sonuçlarla (G3, G5) tutarlıdır.</w:t>
+      </w:r>
+    </w:p>
+    <w:p>
+      <w:pPr>
+        <w:pStyle w:val="Heading3"/>
+      </w:pPr>
+      <w:r>
+        <w:t>6.3 Unity'de görsel karşılaştırma</w:t>
+      </w:r>
+    </w:p>
+    <w:p>
+      <w:pPr>
+        <w:jc w:val="center"/>
+      </w:pPr>
+      <w:r>
+        <w:drawing>
+          <wp:inline xmlns:a="http://schemas.openxmlformats.org/drawingml/2006/main" xmlns:pic="http://schemas.openxmlformats.org/drawingml/2006/picture">
+            <wp:extent cx="5486400" cy="2785589"/>
+            <wp:docPr id="8" name="Picture 8"/>
+            <wp:cNvGraphicFramePr>
+              <a:graphicFrameLocks noChangeAspect="1"/>
+            </wp:cNvGraphicFramePr>
+            <a:graphic>
+              <a:graphicData uri="http://schemas.openxmlformats.org/drawingml/2006/picture">
+                <pic:pic>
+                  <pic:nvPicPr>
+                    <pic:cNvPr id="0" name="sekil8_unity_karsilastirma.jpg"/>
+                    <pic:cNvPicPr/>
+                  </pic:nvPicPr>
+                  <pic:blipFill>
+                    <a:blip r:embed="rId16"/>
+                    <a:stretch>
+                      <a:fillRect/>
+                    </a:stretch>
+                  </pic:blipFill>
+                  <pic:spPr>
+                    <a:xfrm>
+                      <a:off x="0" y="0"/>
+                      <a:ext cx="5486400" cy="2785589"/>
+                    </a:xfrm>
+                    <a:prstGeom prst="rect"/>
+                  </pic:spPr>
+                </pic:pic>
+              </a:graphicData>
+            </a:graphic>
+          </wp:inline>
+        </w:drawing>
+      </w:r>
+    </w:p>
+    <w:p>
+      <w:pPr>
+        <w:jc w:val="center"/>
+      </w:pPr>
+      <w:r>
+        <w:rPr>
+          <w:i/>
+          <w:sz w:val="18"/>
+        </w:rPr>
+        <w:t>Şekil 8 — Unity'de aynı derslik: (a) Luma AI, iç bakış; (b) C1, en iyi iç bakış; (c) C1, sahne dışından; (d) C2, iç bakış. Modellerin koordinat sistemleri farklı olduğundan görüntüler aynı kamera noktasından alınamamıştır.</w:t>
+      </w:r>
+    </w:p>
+    <w:p>
+      <w:r>
+        <w:t>Bulut modelleri iç bakışta tahta, çerçeveli resim, kürsü ve sıraları okunur biçimde gösterir; ancak kenarlarda ve kamera önünde yoğun, iğne biçimli Gaussian'lar vardır ve temiz bir kare yalnızca çekim konumlarına yakın dar açılardan bulunabilir. Sahne dışından bakıldığında model yoğun bir küme ve çevresinde uzun çizgiler olarak görünür (Şekil 8c).</w:t>
+      </w:r>
+    </w:p>
+    <w:p>
+      <w:r>
+        <w:t xml:space="preserve">Luma AI modeli iç bakışta pencere ve jaluzileri, sıra düzenini, tavan aydınlatmasını, projeksiyonu ve duvar prizlerini temiz biçimde gösterir; gezinme rahattır. </w:t>
+      </w:r>
+      <w:r>
+        <w:rPr>
+          <w:b/>
+        </w:rPr>
+        <w:t>Gaussian sayısı kalite ölçüsü değildir:</w:t>
+      </w:r>
+      <w:r>
+        <w:t xml:space="preserve"> Luma 1,07 milyon Gaussian ile temiz, C2 1,26 milyon Gaussian ile dağınıktır.</w:t>
+      </w:r>
+    </w:p>
+    <w:p>
+      <w:r>
+        <w:t xml:space="preserve">Luma'nın neden daha temiz olduğu </w:t>
+      </w:r>
+      <w:r>
+        <w:rPr>
+          <w:b/>
+        </w:rPr>
+        <w:t>bilinmemektedir</w:t>
+      </w:r>
+      <w:r>
+        <w:t>; hizmet kapalıdır, ayarları ve ara çıktıları görünmez. Olası nedenler: videonun tamamının tek modelde kullanılması (bulut hattında karelerin %21'i ana modelin dışında kaldı), dışa aktarmada temizlik ve farklı eğitim ayarları.</w:t>
+      </w:r>
+    </w:p>
+    <w:p>
+      <w:pPr>
+        <w:ind w:left="504"/>
+      </w:pPr>
+      <w:r>
+        <w:rPr>
+          <w:sz w:val="19"/>
+        </w:rPr>
+        <w:t xml:space="preserve">Unity'de splat'ların görünmesi için URP renderer'a </w:t>
+      </w:r>
+      <w:r>
+        <w:rPr>
+          <w:b/>
+          <w:sz w:val="19"/>
+        </w:rPr>
+        <w:t>Gaussian Splat URP Feature</w:t>
+      </w:r>
+      <w:r>
+        <w:rPr>
+          <w:sz w:val="19"/>
+        </w:rPr>
+        <w:t xml:space="preserve"> eklenmesi gerekmiştir; eklenmeden asset doğru olsa bile sahne boş kalmaktadır.</w:t>
+      </w:r>
+    </w:p>
+    <w:p>
+      <w:r>
+        <w:rPr>
+          <w:b/>
+        </w:rPr>
+        <w:t>Karşılaştırma uyarısı:</w:t>
+      </w:r>
+      <w:r>
+        <w:t xml:space="preserve"> C1/C2 ile A hattı modelleri arasındaki görsel fark yalnızca ortamdan kaynaklanmıyor olabilir. C1/C2 </w:t>
+      </w:r>
+      <w:r>
+        <w:rPr>
+          <w:rFonts w:ascii="Consolas" w:hAnsi="Consolas"/>
+          <w:color w:val="B03060"/>
+          <w:sz w:val="19"/>
+        </w:rPr>
+        <w:t>sequential</w:t>
+      </w:r>
+      <w:r>
+        <w:t xml:space="preserve"> eşleştirmeyle ve parçalanmış bir SfM çıktısıyla (823/1.047 kare) eğitilmiştir; A hattı modelleri </w:t>
       </w:r>
       <w:r>
         <w:rPr>
@@ -4193,27 +6092,31 @@
         <w:t>exhaustive</w:t>
       </w:r>
       <w:r>
-        <w:t xml:space="preserve"> aynı 349 kareyi aldı; ilki %42,7'sini kaydedip sahneyi dörde böldü. Aynı örüntü oda denemelerinde de görüldü (R2: iz 3,03, sahne parçalandı — R3: iz 7,90, tek model). Bina ölçeğinde izlenecek birincil SfM göstergesi </w:t>
-      </w:r>
+        <w:t xml:space="preserve"> ile tek bütün model üzerinde eğitilmiştir. Bulgu 1 ışığında, Unity'de gözlenen floater yoğunluğunun büyük bölümü bu SfM farkıyla açıklanabilir.</w:t>
+      </w:r>
+    </w:p>
+    <w:p>
+      <w:pPr>
+        <w:pStyle w:val="Heading2"/>
+      </w:pPr>
+      <w:r>
+        <w:t>7. Bulgular</w:t>
+      </w:r>
+    </w:p>
+    <w:p>
+      <w:r>
+        <w:t>Her maddenin hangi hattan geldiği parantez içinde belirtilmiştir.</w:t>
+      </w:r>
+    </w:p>
+    <w:p>
       <w:r>
         <w:rPr>
           <w:b/>
         </w:rPr>
-        <w:t>ortalama iz uzunluğudur</w:t>
-      </w:r>
-      <w:r>
-        <w:t>, kaydolan görüntü oranı değil.</w:t>
-      </w:r>
-    </w:p>
-    <w:p>
-      <w:r>
-        <w:rPr>
-          <w:b/>
-        </w:rPr>
-        <w:t>2. Düşük piksel hatası kalite göstergesi değildir.</w:t>
-      </w:r>
-      <w:r>
-        <w:t xml:space="preserve"> </w:t>
+        <w:t>1. Örtüşme, kare sayısından daha belirleyicidir.</w:t>
+      </w:r>
+      <w:r>
+        <w:t xml:space="preserve"> (A ve B) </w:t>
       </w:r>
       <w:r>
         <w:rPr>
@@ -4224,7 +6127,60 @@
         <w:t>sequential</w:t>
       </w:r>
       <w:r>
-        <w:t xml:space="preserve"> en düşük yeniden izdüşüm hatasına sahiptir (0,660 px) ama kullanılabilir sonuç üretmeyen tek koşudur: her parça kendi içinde tutarlı çözülmüş, parçalar birbirine bağlanamamıştır. Oda denemelerinde R1 de 0,880 px ile sağlıklı görünüp kullanılabilir geometri üretmemişti.</w:t>
+        <w:t xml:space="preserve"> ile </w:t>
+      </w:r>
+      <w:r>
+        <w:rPr>
+          <w:rFonts w:ascii="Consolas" w:hAnsi="Consolas"/>
+          <w:color w:val="B03060"/>
+          <w:sz w:val="19"/>
+        </w:rPr>
+        <w:t>exhaustive</w:t>
+      </w:r>
+      <w:r>
+        <w:t xml:space="preserve"> aynı 349 kareyi aldı; ilki %42,7'sini kaydedip sahneyi dörde böldü. Aynı örüntü oda denemelerinde (R2: iz 3,03, parçalandı — R3: iz 7,90, tek model) ve bulut hattında da görüldü: 1.047 karelik </w:t>
+      </w:r>
+      <w:r>
+        <w:rPr>
+          <w:rFonts w:ascii="Consolas" w:hAnsi="Consolas"/>
+          <w:color w:val="B03060"/>
+          <w:sz w:val="19"/>
+        </w:rPr>
+        <w:t>sequential</w:t>
+      </w:r>
+      <w:r>
+        <w:t xml:space="preserve"> koşusu sahneyi beşe böldü. </w:t>
+      </w:r>
+      <w:r>
+        <w:rPr>
+          <w:b/>
+        </w:rPr>
+        <w:t>Kareleri üç kat sık almak parçalanmayı önlemedi.</w:t>
+      </w:r>
+      <w:r>
+        <w:t xml:space="preserve"> Bina ölçeğinde izlenecek birincil SfM göstergesi ortalama iz uzunluğudur, kaydolan görüntü oranı değil.</w:t>
+      </w:r>
+    </w:p>
+    <w:p>
+      <w:r>
+        <w:rPr>
+          <w:b/>
+        </w:rPr>
+        <w:t>2. Düşük piksel hatası kalite göstergesi değildir.</w:t>
+      </w:r>
+      <w:r>
+        <w:t xml:space="preserve"> (A ve B) </w:t>
+      </w:r>
+      <w:r>
+        <w:rPr>
+          <w:rFonts w:ascii="Consolas" w:hAnsi="Consolas"/>
+          <w:color w:val="B03060"/>
+          <w:sz w:val="19"/>
+        </w:rPr>
+        <w:t>sequential</w:t>
+      </w:r>
+      <w:r>
+        <w:t xml:space="preserve"> en düşük yeniden izdüşüm hatasına sahiptir (0,660 px) ama kullanılabilir sonuç üretmeyen tek koşudur. Bulut hattındaki parçalı modelde de hata 0,57 px'tir — yani beşe bölünmüş bir sahne, sayısal olarak "daha iyi" görünmektedir. Oda denemelerinde R1 de 0,880 px ile sağlıklı görünüp kullanılabilir geometri üretmemişti.</w:t>
       </w:r>
     </w:p>
     <w:p>
@@ -4235,7 +6191,7 @@
         <w:t>3. Kenar yumuşatma ucuz ve ölçülebilir bir kazançtır.</w:t>
       </w:r>
       <w:r>
-        <w:t xml:space="preserve"> </w:t>
+        <w:t xml:space="preserve"> (A) </w:t>
       </w:r>
       <w:r>
         <w:rPr>
@@ -4246,7 +6202,7 @@
         <w:t>antialiased</w:t>
       </w:r>
       <w:r>
-        <w:t xml:space="preserve"> kipi (Mip-Splatting [02]) üç metrikte de en iyi sonucu verdi; maliyeti %6 ek süre ve 10 MB ek bellektir. Varsayılan olarak açılması önerilir.</w:t>
+        <w:t xml:space="preserve"> kipi (Mip-Splatting [02]) üç metrikte de en iyi sonucu verdi; maliyeti %6 ek süre ve 10 MB ek bellektir.</w:t>
       </w:r>
     </w:p>
     <w:p>
@@ -4282,7 +6238,7 @@
         <w:t>4. Kamera pozu optimizasyonu ölçüm hattı için risklidir.</w:t>
       </w:r>
       <w:r>
-        <w:t xml:space="preserve"> G4 metriklerde belirgin biçimde kötüleşti (PSNR 27,22 → 22,52), ancak Şekil 5 render'ın </w:t>
+        <w:t xml:space="preserve"> (A) G4 metriklerde belirgin biçimde kötüleşti (PSNR 27,22 → 22,52), ancak Şekil 6 render'ın </w:t>
       </w:r>
       <w:r>
         <w:rPr>
@@ -4302,7 +6258,7 @@
         <w:t>SO3xR3</w:t>
       </w:r>
       <w:r>
-        <w:t xml:space="preserve"> eğitim kameralarının pozlarını düzeltir, ayrılmış test kameraları bu düzeltmeyi almaz; model kaydırılmış bir koordinat çerçevesinde öğrenir. Yani düşüş büyük ölçüde hizalama farkıdır, kalite kaybı değil.</w:t>
+        <w:t xml:space="preserve"> eğitim kameralarının pozlarını düzeltir, ayrılmış test kameraları bu düzeltmeyi almaz; model kaydırılmış bir koordinat çerçevesinde öğrenir. Düşüş büyük ölçüde hizalama farkıdır, kalite kaybı değil.</w:t>
       </w:r>
     </w:p>
     <w:p>
@@ -4327,7 +6283,7 @@
         <w:t>5. Gaussian bütçesini artırmak karşılığını vermiyor.</w:t>
       </w:r>
       <w:r>
-        <w:t xml:space="preserve"> </w:t>
+        <w:t xml:space="preserve"> (A ve B) </w:t>
       </w:r>
       <w:r>
         <w:rPr>
@@ -4338,7 +6294,7 @@
         <w:t>splatfacto-big</w:t>
       </w:r>
       <w:r>
-        <w:t xml:space="preserve"> hem 15.000 hem 30.000 iterasyonda önerilen yapılandırmanın gerisinde kaldı. Model dosyası boyutu Gaussian sayısıyla doğrusaldır: her Gaussian </w:t>
+        <w:t xml:space="preserve"> A hattında hem 15.000 hem 30.000 iterasyonda önerilen yapılandırmanın gerisinde kaldı; B hattında da (C2) kazanç gözlenmedi. Model dosyası boyutu Gaussian sayısıyla doğrusaldır: her Gaussian </w:t>
       </w:r>
       <w:r>
         <w:rPr>
@@ -4347,7 +6303,7 @@
         <w:t>248 bayt</w:t>
       </w:r>
       <w:r>
-        <w:t xml:space="preserve"> yer kaplar. Bu, Gaussian bütçesini bir kalite parametresi olduğu kadar </w:t>
+        <w:t xml:space="preserve"> yer kaplar — aynı oran bulut modellerinde de ölçüldü (157 MB / 634.243 ve 312 MB / 1.258.471). Bu, Gaussian bütçesini bir kalite parametresi olduğu kadar </w:t>
       </w:r>
       <w:r>
         <w:rPr>
@@ -4356,7 +6312,7 @@
         <w:t>dağıtım kısıtı</w:t>
       </w:r>
       <w:r>
-        <w:t xml:space="preserve"> hâline getirir — Unity ve VR aşamasında yükleme süresi ve GPU belleği doğrudan dosya boyutuyla ölçeklenecektir.</w:t>
+        <w:t xml:space="preserve"> hâline getirir; Unity ve VR aşamasında yükleme süresi ve GPU belleği doğrudan dosya boyutuyla ölçeklenecektir.</w:t>
       </w:r>
     </w:p>
     <w:p>
@@ -4364,15 +6320,10 @@
         <w:rPr>
           <w:b/>
         </w:rPr>
-        <w:t>6. Darboğaz GPU belleği değildir.</w:t>
-      </w:r>
-      <w:r>
-        <w:t xml:space="preserve"> En ağır splatfacto koşusu 4.889 MB tepe VRAM kullandı; 6.144 MB'nin en fazla %80'i. Hiçbir splatfacto koşusunda bellek taşması olmadı, tam çözünürlük bile sorunsuz çalıştı. Oda denemelerinde sıkışmanın nedeni 12 megapiksellik fotoğraflardı; video karesi 2 megapiksel olduğundan görüntü başına bellek yükü yaklaşık altı kat düşüktür.</w:t>
-      </w:r>
-    </w:p>
-    <w:p>
-      <w:r>
-        <w:t xml:space="preserve">Bina ölçeğindeki gerçek kısıtlar: </w:t>
+        <w:t>6. Darboğaz GPU belleği değil, SfM süresidir.</w:t>
+      </w:r>
+      <w:r>
+        <w:t xml:space="preserve"> (A ve B) A hattında en ağır koşu 4.889 MB tepe VRAM kullandı; 6.144 MB'nin en fazla %80'i, hiçbir koşuda bellek taşması olmadı. Buna karşılık B hattında CUDA'sız COLMAP ile 1.047 karenin SfM aşaması ~1,5 saat sürdü. Bina ölçeğindeki gerçek kısıtlar: </w:t>
       </w:r>
       <w:r>
         <w:rPr>
@@ -4381,7 +6332,7 @@
         <w:t>(a)</w:t>
       </w:r>
       <w:r>
-        <w:t xml:space="preserve"> COLMAP eşleştirme süresi — kare sayısının karesiyle büyür; </w:t>
+        <w:t xml:space="preserve"> COLMAP eşleştirme süresi — kare sayısının karesiyle büyür ve CUDA desteği olmadan katlanır; </w:t>
       </w:r>
       <w:r>
         <w:rPr>
@@ -4399,7 +6350,7 @@
         <w:t>(c)</w:t>
       </w:r>
       <w:r>
-        <w:t xml:space="preserve"> sahne parçalanma riski — kare sayısı ve mekân karmaşıklığı arttıkça COLMAP'in tek model kuramama olasılığı yükselir.</w:t>
+        <w:t xml:space="preserve"> sahne parçalanma riski.</w:t>
       </w:r>
     </w:p>
     <w:p>
@@ -4407,10 +6358,10 @@
         <w:rPr>
           <w:b/>
         </w:rPr>
-        <w:t>7. Gaussian'lar çekim yönüne bağlıdır.</w:t>
-      </w:r>
-      <w:r>
-        <w:t xml:space="preserve"> Model, çekim yönlerinden uzak bir bakış açısından (örneğin tam tepeden) render edildiğinde Gaussian'lar kenarlarından görülüp iğneye dönüşmektedir; bu çekimden kat planı benzeri bir üstten görünüm elde edilememiştir. Görsel katmanın ölçüm katmanı yerine geçemeyeceğinin somut göstergesidir.</w:t>
+        <w:t>7. İterasyon sayısı 30.000 olmalıdır.</w:t>
+      </w:r>
+      <w:r>
+        <w:t xml:space="preserve"> (A) 15.000'den 30.000'e çıkmak önerilen yapılandırmada PSNR'ı 0,67 dB, LPIPS'i 0,1697'den 0,1525'e iyileştirdi.</w:t>
       </w:r>
     </w:p>
     <w:p>
@@ -4421,7 +6372,7 @@
         <w:t>8. 3DGS seçimi ölçümle desteklenmektedir.</w:t>
       </w:r>
       <w:r>
-        <w:t xml:space="preserve"> NeRF aynı veri ve iterasyonla her ölçütte geride kaldı (Bölüm 5.4). </w:t>
+        <w:t xml:space="preserve"> (A) NeRF aynı veri ve iterasyonla her ölçütte geride kaldı. </w:t>
       </w:r>
       <w:r>
         <w:rPr>
@@ -4431,6 +6382,28 @@
       </w:r>
       <w:r>
         <w:t xml:space="preserve"> raporunda gerekçeye dayanarak alınan Splatfacto kararı artık ölçüme dayanmaktadır.</w:t>
+      </w:r>
+    </w:p>
+    <w:p>
+      <w:r>
+        <w:rPr>
+          <w:b/>
+        </w:rPr>
+        <w:t>9. Gaussian'lar çekim yönüne bağlıdır.</w:t>
+      </w:r>
+      <w:r>
+        <w:t xml:space="preserve"> (A ve B) Model, çekim yönlerinden uzak bir bakış açısından (tam tepeden ya da sahne dışından) render edildiğinde Gaussian'lar kenarlarından görülüp iğneye dönüşmektedir; olgu bulut modellerinde çok daha belirgindir (Şekil 8c). Bu çekimden kat planı benzeri bir üstten görünüm elde edilememiştir. Görsel katman, ölçüm katmanının yerine geçemez.</w:t>
+      </w:r>
+    </w:p>
+    <w:p>
+      <w:r>
+        <w:rPr>
+          <w:b/>
+        </w:rPr>
+        <w:t>10. Hazır hizmet görsel kalitede öndedir, ancak ölçüm hattına uygun değildir.</w:t>
+      </w:r>
+      <w:r>
+        <w:t xml:space="preserve"> (B) Luma AI aynı videodan en temiz ve en rahat gezilebilen modeli üretti. Ancak ayarları, ara çıktıları ve eğitim kareleri görünmediği için sonucu ölçülemez, tekrarlanamaz ve COLMAP çerçevesiyle ilişkisi bilinmez. Görsel sunum katmanı için yedek seçenek olarak değerlendirilebilir.</w:t>
       </w:r>
     </w:p>
     <w:p>
@@ -4438,7 +6411,7 @@
         <w:pStyle w:val="Heading2"/>
       </w:pPr>
       <w:r>
-        <w:t>7. Öneriler</w:t>
+        <w:t>8. Öneriler</w:t>
       </w:r>
     </w:p>
     <w:p>
@@ -4446,7 +6419,7 @@
         <w:pStyle w:val="Heading3"/>
       </w:pPr>
       <w:r>
-        <w:t>7.1 Önerilen yapılandırma</w:t>
+        <w:t>8.1 Önerilen yapılandırma</w:t>
       </w:r>
     </w:p>
     <w:tbl>
@@ -4771,7 +6744,48 @@
               <w:rPr>
                 <w:sz w:val="18"/>
               </w:rPr>
-              <w:t>Bölüm 5.3</w:t>
+              <w:t>Bulgu 7</w:t>
+            </w:r>
+          </w:p>
+        </w:tc>
+      </w:tr>
+      <w:tr>
+        <w:tc>
+          <w:tcPr>
+            <w:tcW w:type="dxa" w:w="2880"/>
+          </w:tcPr>
+          <w:p>
+            <w:r>
+              <w:rPr>
+                <w:sz w:val="18"/>
+              </w:rPr>
+              <w:t>SfM ortamı</w:t>
+            </w:r>
+          </w:p>
+        </w:tc>
+        <w:tc>
+          <w:tcPr>
+            <w:tcW w:type="dxa" w:w="2880"/>
+          </w:tcPr>
+          <w:p>
+            <w:r>
+              <w:rPr>
+                <w:sz w:val="18"/>
+              </w:rPr>
+              <w:t>CUDA destekli COLMAP</w:t>
+            </w:r>
+          </w:p>
+        </w:tc>
+        <w:tc>
+          <w:tcPr>
+            <w:tcW w:type="dxa" w:w="2880"/>
+          </w:tcPr>
+          <w:p>
+            <w:r>
+              <w:rPr>
+                <w:sz w:val="18"/>
+              </w:rPr>
+              <w:t>Bulgu 6</w:t>
             </w:r>
           </w:p>
         </w:tc>
@@ -4797,7 +6811,7 @@
         <w:pStyle w:val="Heading3"/>
       </w:pPr>
       <w:r>
-        <w:t>7.2 Bina ölçeğine dair</w:t>
+        <w:t>8.2 Bina ölçeğine dair</w:t>
       </w:r>
     </w:p>
     <w:tbl>
@@ -4920,7 +6934,7 @@
               <w:rPr>
                 <w:sz w:val="18"/>
               </w:rPr>
-              <w:t xml:space="preserve"> daha büyük veriyle ölçülmelidir; kesişim noktası 349 karenin üzerindedir</w:t>
+              <w:t xml:space="preserve"> daha büyük veriyle ölçülmelidir</w:t>
             </w:r>
           </w:p>
         </w:tc>
@@ -4976,7 +6990,14 @@
               <w:rPr>
                 <w:sz w:val="18"/>
               </w:rPr>
-              <w:t>6 GB VRAM yeterlidir; öncelik daha hızlı GPU, daha büyük VRAM değil</w:t>
+              <w:t xml:space="preserve">6 GB VRAM yeterlidir; öncelik daha hızlı GPU ve </w:t>
+            </w:r>
+            <w:r>
+              <w:rPr>
+                <w:b/>
+                <w:sz w:val="18"/>
+              </w:rPr>
+              <w:t>CUDA destekli COLMAP</w:t>
             </w:r>
           </w:p>
         </w:tc>
@@ -4991,7 +7012,7 @@
               <w:rPr>
                 <w:sz w:val="18"/>
               </w:rPr>
-              <w:t>Model boyutu</w:t>
+              <w:t>Bulut ortamı</w:t>
             </w:r>
           </w:p>
         </w:tc>
@@ -5004,7 +7025,7 @@
               <w:rPr>
                 <w:sz w:val="18"/>
               </w:rPr>
-              <w:t>Tek derslik 134 MiB; bir kat için toplam boyut ve Unity yükleme bütçesi önceden hesaplanmalıdır</w:t>
+              <w:t>COLMAP CUDA destekli kurulmalı ya da SfM yerelde çalıştırılıp sonuç buluta taşınmalı; oturum kopmalarına karşı ara çıktılar düzenli yedeklenmeli</w:t>
             </w:r>
           </w:p>
         </w:tc>
@@ -5019,6 +7040,34 @@
               <w:rPr>
                 <w:sz w:val="18"/>
               </w:rPr>
+              <w:t>Model boyutu</w:t>
+            </w:r>
+          </w:p>
+        </w:tc>
+        <w:tc>
+          <w:tcPr>
+            <w:tcW w:type="dxa" w:w="4320"/>
+          </w:tcPr>
+          <w:p>
+            <w:r>
+              <w:rPr>
+                <w:sz w:val="18"/>
+              </w:rPr>
+              <w:t>Tek derslik 134–312 MiB; bir kat için toplam boyut ve Unity yükleme bütçesi önceden hesaplanmalıdır</w:t>
+            </w:r>
+          </w:p>
+        </w:tc>
+      </w:tr>
+      <w:tr>
+        <w:tc>
+          <w:tcPr>
+            <w:tcW w:type="dxa" w:w="4320"/>
+          </w:tcPr>
+          <w:p>
+            <w:r>
+              <w:rPr>
+                <w:sz w:val="18"/>
+              </w:rPr>
               <w:t>Çekim planı</w:t>
             </w:r>
           </w:p>
@@ -5032,7 +7081,35 @@
               <w:rPr>
                 <w:sz w:val="18"/>
               </w:rPr>
-              <w:t>Sabit adım aralığı; aynı noktadan seri çekim yapılmamalı (oda denemelerinde kamera merkezleri arası medyan mesafe 0,0000 ölçüldü: üst üste çakışan kareler maliyet ekleyip paralaks katmıyor)</w:t>
+              <w:t>Sabit adım aralığı; ani yakın çekimlerden ve boş duvara uzun süre bakmaktan kaçınılmalı; başlangıç noktasına dönülerek döngü kapatılmalı</w:t>
+            </w:r>
+          </w:p>
+        </w:tc>
+      </w:tr>
+      <w:tr>
+        <w:tc>
+          <w:tcPr>
+            <w:tcW w:type="dxa" w:w="4320"/>
+          </w:tcPr>
+          <w:p>
+            <w:r>
+              <w:rPr>
+                <w:sz w:val="18"/>
+              </w:rPr>
+              <w:t>Hazır hizmet</w:t>
+            </w:r>
+          </w:p>
+        </w:tc>
+        <w:tc>
+          <w:tcPr>
+            <w:tcW w:type="dxa" w:w="4320"/>
+          </w:tcPr>
+          <w:p>
+            <w:r>
+              <w:rPr>
+                <w:sz w:val="18"/>
+              </w:rPr>
+              <w:t>Görsel sunum için yedek seçenek; ölçüm hattında kullanılmamalı</w:t>
             </w:r>
           </w:p>
         </w:tc>
@@ -5044,7 +7121,7 @@
         <w:pStyle w:val="Heading3"/>
       </w:pPr>
       <w:r>
-        <w:t>7.3 Ölçek</w:t>
+        <w:t>8.3 Ölçek</w:t>
       </w:r>
     </w:p>
     <w:p>
@@ -5071,7 +7148,13 @@
     </w:p>
     <w:p>
       <w:r>
-        <w:t>Koşu kayıtları (ayarlar, metrikler, yeniden üretim adımları):</w:t>
+        <w:rPr>
+          <w:b/>
+        </w:rPr>
+        <w:t>A hattı</w:t>
+      </w:r>
+      <w:r>
+        <w:t xml:space="preserve"> koşu kayıtları (ayarlar, metrikler, yeniden üretim adımları):</w:t>
       </w:r>
     </w:p>
     <w:p>
@@ -5107,24 +7190,19 @@
       </w:r>
     </w:p>
     <w:p>
-      <w:r>
-        <w:t>Yerel çalışma klasörleri (boyut nedeniyle sürümlenmez):</w:t>
-      </w:r>
-    </w:p>
-    <w:p>
+      <w:pPr>
+        <w:pStyle w:val="ListBullet"/>
+      </w:pPr>
       <w:r>
         <w:rPr>
           <w:rFonts w:ascii="Consolas" w:hAnsi="Consolas"/>
-          <w:sz w:val="17"/>
+          <w:color w:val="B03060"/>
+          <w:sz w:val="19"/>
         </w:rPr>
-        <w:t>data/&lt;veri-kümesi&gt;/        ham kareler ve COLMAP çıktıları</w:t>
-        <w:br/>
-        <w:t>runs/&lt;veri-kümesi&gt;/&lt;koşu&gt;/ eğitim çıktıları ve kontrol noktaları</w:t>
-      </w:r>
-    </w:p>
-    <w:p>
-      <w:r>
-        <w:t xml:space="preserve">Üretilen </w:t>
+        <w:t>models/</w:t>
+      </w:r>
+      <w:r>
+        <w:t xml:space="preserve"> — üretilen </w:t>
       </w:r>
       <w:r>
         <w:rPr>
@@ -5135,7 +7213,18 @@
         <w:t>.ply</w:t>
       </w:r>
       <w:r>
-        <w:t xml:space="preserve"> modelleri </w:t>
+        <w:t xml:space="preserve"> modelleri (Git LFS)</w:t>
+      </w:r>
+    </w:p>
+    <w:p>
+      <w:r>
+        <w:rPr>
+          <w:b/>
+        </w:rPr>
+        <w:t>B hattı</w:t>
+      </w:r>
+      <w:r>
+        <w:t xml:space="preserve"> çıktıları (COLMAP modelleri, eğitim kayıtları, değerlendirme dosyaları, PLY): Google Drive </w:t>
       </w:r>
       <w:r>
         <w:rPr>
@@ -5143,10 +7232,171 @@
           <w:color w:val="B03060"/>
           <w:sz w:val="19"/>
         </w:rPr>
-        <w:t>models/</w:t>
-      </w:r>
-      <w:r>
-        <w:t xml:space="preserve"> altında Git LFS ile sürümlenir.</w:t>
+        <w:t>oda3_yedek/</w:t>
+      </w:r>
+    </w:p>
+    <w:p>
+      <w:r>
+        <w:t xml:space="preserve">Betikler </w:t>
+      </w:r>
+      <w:r>
+        <w:rPr>
+          <w:rFonts w:ascii="Consolas" w:hAnsi="Consolas"/>
+          <w:color w:val="B03060"/>
+          <w:sz w:val="19"/>
+        </w:rPr>
+        <w:t>scripts/</w:t>
+      </w:r>
+      <w:r>
+        <w:t xml:space="preserve"> altındadır: </w:t>
+      </w:r>
+      <w:r>
+        <w:rPr>
+          <w:rFonts w:ascii="Consolas" w:hAnsi="Consolas"/>
+          <w:color w:val="B03060"/>
+          <w:sz w:val="19"/>
+        </w:rPr>
+        <w:t>sfm_run.py</w:t>
+      </w:r>
+      <w:r>
+        <w:t xml:space="preserve">, </w:t>
+      </w:r>
+      <w:r>
+        <w:rPr>
+          <w:rFonts w:ascii="Consolas" w:hAnsi="Consolas"/>
+          <w:color w:val="B03060"/>
+          <w:sz w:val="19"/>
+        </w:rPr>
+        <w:t>colmap_stats.py</w:t>
+      </w:r>
+      <w:r>
+        <w:t xml:space="preserve">, </w:t>
+      </w:r>
+      <w:r>
+        <w:rPr>
+          <w:rFonts w:ascii="Consolas" w:hAnsi="Consolas"/>
+          <w:color w:val="B03060"/>
+          <w:sz w:val="19"/>
+        </w:rPr>
+        <w:t>fix_transforms.py</w:t>
+      </w:r>
+      <w:r>
+        <w:t xml:space="preserve">, </w:t>
+      </w:r>
+      <w:r>
+        <w:rPr>
+          <w:rFonts w:ascii="Consolas" w:hAnsi="Consolas"/>
+          <w:color w:val="B03060"/>
+          <w:sz w:val="19"/>
+        </w:rPr>
+        <w:t>train_run.py</w:t>
+      </w:r>
+      <w:r>
+        <w:t xml:space="preserve">, </w:t>
+      </w:r>
+      <w:r>
+        <w:rPr>
+          <w:rFonts w:ascii="Consolas" w:hAnsi="Consolas"/>
+          <w:color w:val="B03060"/>
+          <w:sz w:val="19"/>
+        </w:rPr>
+        <w:t>run_queue.sh</w:t>
+      </w:r>
+      <w:r>
+        <w:t xml:space="preserve">, </w:t>
+      </w:r>
+      <w:r>
+        <w:rPr>
+          <w:rFonts w:ascii="Consolas" w:hAnsi="Consolas"/>
+          <w:color w:val="B03060"/>
+          <w:sz w:val="19"/>
+        </w:rPr>
+        <w:t>run_queue_30k.sh</w:t>
+      </w:r>
+      <w:r>
+        <w:t xml:space="preserve">, </w:t>
+      </w:r>
+      <w:r>
+        <w:rPr>
+          <w:rFonts w:ascii="Consolas" w:hAnsi="Consolas"/>
+          <w:color w:val="B03060"/>
+          <w:sz w:val="19"/>
+        </w:rPr>
+        <w:t>eval_run.py</w:t>
+      </w:r>
+      <w:r>
+        <w:t xml:space="preserve">, </w:t>
+      </w:r>
+      <w:r>
+        <w:rPr>
+          <w:rFonts w:ascii="Consolas" w:hAnsi="Consolas"/>
+          <w:color w:val="B03060"/>
+          <w:sz w:val="19"/>
+        </w:rPr>
+        <w:t>render_compare.py</w:t>
+      </w:r>
+      <w:r>
+        <w:t xml:space="preserve">, </w:t>
+      </w:r>
+      <w:r>
+        <w:rPr>
+          <w:rFonts w:ascii="Consolas" w:hAnsi="Consolas"/>
+          <w:color w:val="B03060"/>
+          <w:sz w:val="19"/>
+        </w:rPr>
+        <w:t>render_overview.py</w:t>
+      </w:r>
+      <w:r>
+        <w:t xml:space="preserve">, </w:t>
+      </w:r>
+      <w:r>
+        <w:rPr>
+          <w:rFonts w:ascii="Consolas" w:hAnsi="Consolas"/>
+          <w:color w:val="B03060"/>
+          <w:sz w:val="19"/>
+        </w:rPr>
+        <w:t>export_all_ply.sh</w:t>
+      </w:r>
+      <w:r>
+        <w:t xml:space="preserve">, </w:t>
+      </w:r>
+      <w:r>
+        <w:rPr>
+          <w:rFonts w:ascii="Consolas" w:hAnsi="Consolas"/>
+          <w:color w:val="B03060"/>
+          <w:sz w:val="19"/>
+        </w:rPr>
+        <w:t>make_figures.py</w:t>
+      </w:r>
+      <w:r>
+        <w:t xml:space="preserve">, </w:t>
+      </w:r>
+      <w:r>
+        <w:rPr>
+          <w:rFonts w:ascii="Consolas" w:hAnsi="Consolas"/>
+          <w:color w:val="B03060"/>
+          <w:sz w:val="19"/>
+        </w:rPr>
+        <w:t>md_to_docx.py</w:t>
+      </w:r>
+      <w:r>
+        <w:t xml:space="preserve">, </w:t>
+      </w:r>
+      <w:r>
+        <w:rPr>
+          <w:rFonts w:ascii="Consolas" w:hAnsi="Consolas"/>
+          <w:color w:val="B03060"/>
+          <w:sz w:val="19"/>
+        </w:rPr>
+        <w:t>install_tcnn.bat</w:t>
+      </w:r>
+      <w:r>
+        <w:t>.</w:t>
+      </w:r>
+    </w:p>
+    <w:p>
+      <w:r>
+        <w:t>Ham kareler ve eğitim çıktıları boyut nedeniyle sürümlenmez.</w:t>
       </w:r>
     </w:p>
     <w:p>
@@ -5307,6 +7557,25 @@
       </w:r>
       <w:r>
         <w:t>, XR Salento 2025.</w:t>
+      </w:r>
+    </w:p>
+    <w:p>
+      <w:pPr>
+        <w:pStyle w:val="ListBullet"/>
+      </w:pPr>
+      <w:r>
+        <w:t xml:space="preserve">Nerfstudio — Splatfacto belgesi (docs.nerf.studio): </w:t>
+      </w:r>
+      <w:r>
+        <w:rPr>
+          <w:rFonts w:ascii="Consolas" w:hAnsi="Consolas"/>
+          <w:color w:val="B03060"/>
+          <w:sz w:val="19"/>
+        </w:rPr>
+        <w:t>splatfacto-big</w:t>
+      </w:r>
+      <w:r>
+        <w:t xml:space="preserve"> ve PhysGaussian'dan alınan ölçek düzenlemesi.</w:t>
       </w:r>
     </w:p>
     <w:sectPr>

</xml_diff>